<commit_message>
Implement sequential provider ID generation
</commit_message>
<xml_diff>
--- a/Workly SRS.docx
+++ b/Workly SRS.docx
@@ -2,7 +2,6 @@
 <file path=word/document.xml><?xml version="1.0" encoding="utf-8"?>
 <w:document xmlns:wpc="http://schemas.microsoft.com/office/word/2010/wordprocessingCanvas" xmlns:cx="http://schemas.microsoft.com/office/drawing/2014/chartex" xmlns:cx1="http://schemas.microsoft.com/office/drawing/2015/9/8/chartex" xmlns:cx2="http://schemas.microsoft.com/office/drawing/2015/10/21/chartex" xmlns:cx3="http://schemas.microsoft.com/office/drawing/2016/5/9/chartex" xmlns:cx4="http://schemas.microsoft.com/office/drawing/2016/5/10/chartex" xmlns:cx5="http://schemas.microsoft.com/office/drawing/2016/5/11/chartex" xmlns:cx6="http://schemas.microsoft.com/office/drawing/2016/5/12/chartex" xmlns:cx7="http://schemas.microsoft.com/office/drawing/2016/5/13/chartex" xmlns:cx8="http://schemas.microsoft.com/office/drawing/2016/5/14/chartex" xmlns:mc="http://schemas.openxmlformats.org/markup-compatibility/2006" xmlns:aink="http://schemas.microsoft.com/office/drawing/2016/ink" xmlns:am3d="http://schemas.microsoft.com/office/drawing/2017/model3d" xmlns:o="urn:schemas-microsoft-com:office:office" xmlns:oel="http://schemas.microsoft.com/office/2019/extlst" xmlns:r="http://schemas.openxmlformats.org/officeDocument/2006/relationships" xmlns:m="http://schemas.openxmlformats.org/officeDocument/2006/math" xmlns:v="urn:schemas-microsoft-com:vml" xmlns:wp14="http://schemas.microsoft.com/office/word/2010/wordprocessingDrawing" xmlns:wp="http://schemas.openxmlformats.org/drawingml/2006/wordprocessingDrawing" xmlns:w10="urn:schemas-microsoft-com:office:word" xmlns:w="http://schemas.openxmlformats.org/wordprocessingml/2006/main" xmlns:w14="http://schemas.microsoft.com/office/word/2010/wordml" xmlns:w15="http://schemas.microsoft.com/office/word/2012/wordml" xmlns:w16cei="http://schemas.microsoft.com/office/word/2026/wordml/cei" xmlns:w16cex="http://schemas.microsoft.com/office/word/2018/wordml/cex" xmlns:w16cid="http://schemas.microsoft.com/office/word/2016/wordml/cid" xmlns:w16="http://schemas.microsoft.com/office/word/2018/wordml" xmlns:w16du="http://schemas.microsoft.com/office/word/2023/wordml/word16du" xmlns:w16sdtdh="http://schemas.microsoft.com/office/word/2020/wordml/sdtdatahash" xmlns:w16sdtfl="http://schemas.microsoft.com/office/word/2024/wordml/sdtformatlock" xmlns:w16se="http://schemas.microsoft.com/office/word/2015/wordml/symex" xmlns:wpg="http://schemas.microsoft.com/office/word/2010/wordprocessingGroup" xmlns:wpi="http://schemas.microsoft.com/office/word/2010/wordprocessingInk" xmlns:wne="http://schemas.microsoft.com/office/word/2006/wordml" xmlns:wps="http://schemas.microsoft.com/office/word/2010/wordprocessingShape" mc:Ignorable="w14 w15 w16se w16cid w16 w16cex w16sdtdh w16sdtfl w16du wp14">
   <w:body>
-    <w:p/>
     <w:p/>
     <w:p>
       <w:r>
@@ -133,17 +132,10 @@
     </w:p>
     <w:p>
       <w:pPr>
-        <w:rPr>
-          <w:rFonts w:ascii="Times New Roman" w:hAnsi="Times New Roman" w:cs="Times New Roman"/>
-        </w:rPr>
-      </w:pPr>
-    </w:p>
-    <w:p>
-      <w:pPr>
         <w:tabs>
           <w:tab w:val="center" w:pos="4412"/>
         </w:tabs>
-        <w:spacing w:after="0"/>
+        <w:spacing w:after="0" w:line="276" w:lineRule="auto"/>
         <w:ind w:left="-15"/>
         <w:rPr>
           <w:rFonts w:ascii="Times New Roman" w:hAnsi="Times New Roman" w:cs="Times New Roman"/>
@@ -184,6 +176,319 @@
         </w:rPr>
         <w:t>Workly – Home Service Provider Platform</w:t>
       </w:r>
+    </w:p>
+    <w:p>
+      <w:pPr>
+        <w:tabs>
+          <w:tab w:val="center" w:pos="5121"/>
+        </w:tabs>
+        <w:spacing w:after="105" w:line="276" w:lineRule="auto"/>
+        <w:ind w:left="-15"/>
+        <w:rPr>
+          <w:rFonts w:ascii="Times New Roman" w:eastAsia="Times New Roman" w:hAnsi="Times New Roman" w:cs="Times New Roman"/>
+          <w:b/>
+          <w:sz w:val="32"/>
+        </w:rPr>
+      </w:pPr>
+      <w:r>
+        <w:rPr>
+          <w:rFonts w:ascii="Times New Roman" w:eastAsia="Times New Roman" w:hAnsi="Times New Roman" w:cs="Times New Roman"/>
+          <w:sz w:val="28"/>
+        </w:rPr>
+        <w:t xml:space="preserve"> </w:t>
+      </w:r>
+      <w:r>
+        <w:rPr>
+          <w:rFonts w:ascii="Times New Roman" w:eastAsia="Times New Roman" w:hAnsi="Times New Roman" w:cs="Times New Roman"/>
+          <w:sz w:val="28"/>
+        </w:rPr>
+        <w:tab/>
+      </w:r>
+      <w:r>
+        <w:rPr>
+          <w:rFonts w:ascii="Times New Roman" w:eastAsia="Times New Roman" w:hAnsi="Times New Roman" w:cs="Times New Roman"/>
+          <w:sz w:val="32"/>
+        </w:rPr>
+        <w:t>Module Code:</w:t>
+      </w:r>
+      <w:r>
+        <w:rPr>
+          <w:rFonts w:ascii="Times New Roman" w:eastAsia="Times New Roman" w:hAnsi="Times New Roman" w:cs="Times New Roman"/>
+          <w:b/>
+          <w:sz w:val="32"/>
+        </w:rPr>
+        <w:t xml:space="preserve"> CSC </w:t>
+      </w:r>
+      <w:r>
+        <w:rPr>
+          <w:rFonts w:ascii="Times New Roman" w:eastAsia="Times New Roman" w:hAnsi="Times New Roman" w:cs="Times New Roman"/>
+          <w:b/>
+          <w:sz w:val="32"/>
+        </w:rPr>
+        <w:t>2032</w:t>
+      </w:r>
+      <w:r>
+        <w:rPr>
+          <w:rFonts w:ascii="Times New Roman" w:eastAsia="Times New Roman" w:hAnsi="Times New Roman" w:cs="Times New Roman"/>
+          <w:b/>
+          <w:sz w:val="32"/>
+        </w:rPr>
+        <w:t xml:space="preserve"> – </w:t>
+      </w:r>
+      <w:r>
+        <w:rPr>
+          <w:rFonts w:ascii="Times New Roman" w:eastAsia="Times New Roman" w:hAnsi="Times New Roman" w:cs="Times New Roman"/>
+          <w:b/>
+          <w:sz w:val="32"/>
+        </w:rPr>
+        <w:t>Object Oriented Pro</w:t>
+      </w:r>
+      <w:r>
+        <w:rPr>
+          <w:rFonts w:ascii="Times New Roman" w:eastAsia="Times New Roman" w:hAnsi="Times New Roman" w:cs="Times New Roman"/>
+          <w:b/>
+          <w:sz w:val="32"/>
+        </w:rPr>
+        <w:t xml:space="preserve">gramming  </w:t>
+      </w:r>
+    </w:p>
+    <w:p>
+      <w:pPr>
+        <w:widowControl w:val="0"/>
+        <w:tabs>
+          <w:tab w:val="left" w:pos="3560"/>
+        </w:tabs>
+        <w:spacing w:line="276" w:lineRule="auto"/>
+        <w:rPr>
+          <w:rFonts w:ascii="Times New Roman" w:eastAsia="Times New Roman" w:hAnsi="Times New Roman" w:cs="Times New Roman"/>
+          <w:b/>
+          <w:bCs/>
+          <w:sz w:val="28"/>
+          <w:szCs w:val="28"/>
+        </w:rPr>
+      </w:pPr>
+      <w:r>
+        <w:rPr>
+          <w:rFonts w:ascii="Times New Roman" w:eastAsia="Times New Roman" w:hAnsi="Times New Roman" w:cs="Times New Roman"/>
+          <w:sz w:val="32"/>
+          <w:szCs w:val="32"/>
+        </w:rPr>
+        <w:t xml:space="preserve">            </w:t>
+      </w:r>
+      <w:r>
+        <w:rPr>
+          <w:rFonts w:ascii="Times New Roman" w:eastAsia="Times New Roman" w:hAnsi="Times New Roman" w:cs="Times New Roman"/>
+          <w:sz w:val="32"/>
+          <w:szCs w:val="32"/>
+        </w:rPr>
+        <w:t xml:space="preserve"> </w:t>
+      </w:r>
+      <w:r>
+        <w:rPr>
+          <w:rFonts w:ascii="Times New Roman" w:eastAsia="Times New Roman" w:hAnsi="Times New Roman" w:cs="Times New Roman"/>
+          <w:sz w:val="32"/>
+          <w:szCs w:val="32"/>
+        </w:rPr>
+        <w:t xml:space="preserve"> </w:t>
+      </w:r>
+      <w:r>
+        <w:rPr>
+          <w:rFonts w:ascii="Times New Roman" w:eastAsia="Times New Roman" w:hAnsi="Times New Roman" w:cs="Times New Roman"/>
+          <w:sz w:val="32"/>
+          <w:szCs w:val="32"/>
+        </w:rPr>
+        <w:t xml:space="preserve"> </w:t>
+      </w:r>
+      <w:r>
+        <w:rPr>
+          <w:rFonts w:ascii="Times New Roman" w:eastAsia="Times New Roman" w:hAnsi="Times New Roman" w:cs="Times New Roman"/>
+          <w:sz w:val="32"/>
+          <w:szCs w:val="32"/>
+        </w:rPr>
+        <w:t>Lecturer in-charge</w:t>
+      </w:r>
+      <w:r>
+        <w:rPr>
+          <w:rFonts w:ascii="Times New Roman" w:eastAsia="Times New Roman" w:hAnsi="Times New Roman" w:cs="Times New Roman"/>
+          <w:sz w:val="26"/>
+          <w:szCs w:val="26"/>
+        </w:rPr>
+        <w:tab/>
+      </w:r>
+      <w:r>
+        <w:rPr>
+          <w:rFonts w:ascii="Times New Roman" w:eastAsia="Times New Roman" w:hAnsi="Times New Roman" w:cs="Times New Roman"/>
+          <w:b/>
+          <w:bCs/>
+          <w:sz w:val="26"/>
+          <w:szCs w:val="26"/>
+        </w:rPr>
+        <w:t xml:space="preserve"> </w:t>
+      </w:r>
+      <w:r>
+        <w:rPr>
+          <w:rFonts w:ascii="Times New Roman" w:eastAsia="Times New Roman" w:hAnsi="Times New Roman" w:cs="Times New Roman"/>
+          <w:b/>
+          <w:sz w:val="36"/>
+          <w:szCs w:val="28"/>
+        </w:rPr>
+        <w:t>–</w:t>
+      </w:r>
+      <w:r>
+        <w:rPr>
+          <w:rFonts w:ascii="Times New Roman" w:eastAsia="Times New Roman" w:hAnsi="Times New Roman" w:cs="Times New Roman"/>
+          <w:b/>
+          <w:bCs/>
+          <w:sz w:val="28"/>
+          <w:szCs w:val="28"/>
+        </w:rPr>
+        <w:t xml:space="preserve">Ms. N. H. </w:t>
+      </w:r>
+      <w:proofErr w:type="spellStart"/>
+      <w:r>
+        <w:rPr>
+          <w:rFonts w:ascii="Times New Roman" w:eastAsia="Times New Roman" w:hAnsi="Times New Roman" w:cs="Times New Roman"/>
+          <w:b/>
+          <w:bCs/>
+          <w:sz w:val="28"/>
+          <w:szCs w:val="28"/>
+        </w:rPr>
+        <w:t>Wanigasingh</w:t>
+      </w:r>
+      <w:r>
+        <w:rPr>
+          <w:rFonts w:ascii="Times New Roman" w:eastAsia="Times New Roman" w:hAnsi="Times New Roman" w:cs="Times New Roman"/>
+          <w:b/>
+          <w:bCs/>
+          <w:sz w:val="28"/>
+          <w:szCs w:val="28"/>
+        </w:rPr>
+        <w:t>e</w:t>
+      </w:r>
+      <w:proofErr w:type="spellEnd"/>
+    </w:p>
+    <w:p>
+      <w:pPr>
+        <w:widowControl w:val="0"/>
+        <w:tabs>
+          <w:tab w:val="left" w:pos="3560"/>
+        </w:tabs>
+        <w:spacing w:line="276" w:lineRule="auto"/>
+        <w:rPr>
+          <w:rFonts w:ascii="Times New Roman" w:eastAsia="Times New Roman" w:hAnsi="Times New Roman" w:cs="Times New Roman"/>
+          <w:sz w:val="26"/>
+          <w:szCs w:val="26"/>
+        </w:rPr>
+      </w:pPr>
+      <w:r>
+        <w:rPr>
+          <w:rFonts w:ascii="Times New Roman" w:eastAsia="Times New Roman" w:hAnsi="Times New Roman" w:cs="Times New Roman"/>
+          <w:b/>
+          <w:bCs/>
+          <w:sz w:val="28"/>
+          <w:szCs w:val="28"/>
+        </w:rPr>
+        <w:t xml:space="preserve">                 </w:t>
+      </w:r>
+      <w:r>
+        <w:rPr>
+          <w:rFonts w:ascii="Times New Roman" w:eastAsia="Times New Roman" w:hAnsi="Times New Roman" w:cs="Times New Roman"/>
+          <w:b/>
+          <w:bCs/>
+          <w:sz w:val="28"/>
+          <w:szCs w:val="28"/>
+        </w:rPr>
+        <w:t>Hosted</w:t>
+      </w:r>
+      <w:r>
+        <w:rPr>
+          <w:rFonts w:ascii="Times New Roman" w:eastAsia="Times New Roman" w:hAnsi="Times New Roman" w:cs="Times New Roman"/>
+          <w:b/>
+          <w:bCs/>
+          <w:sz w:val="28"/>
+          <w:szCs w:val="28"/>
+        </w:rPr>
+        <w:t xml:space="preserve"> </w:t>
+      </w:r>
+      <w:r>
+        <w:rPr>
+          <w:rFonts w:ascii="Times New Roman" w:eastAsia="Times New Roman" w:hAnsi="Times New Roman" w:cs="Times New Roman"/>
+          <w:b/>
+          <w:bCs/>
+          <w:sz w:val="28"/>
+          <w:szCs w:val="28"/>
+        </w:rPr>
+        <w:t xml:space="preserve">Link </w:t>
+      </w:r>
+      <w:proofErr w:type="gramStart"/>
+      <w:r>
+        <w:rPr>
+          <w:rFonts w:ascii="Times New Roman" w:eastAsia="Times New Roman" w:hAnsi="Times New Roman" w:cs="Times New Roman"/>
+          <w:b/>
+          <w:bCs/>
+          <w:sz w:val="28"/>
+          <w:szCs w:val="28"/>
+        </w:rPr>
+        <w:t>Of</w:t>
+      </w:r>
+      <w:proofErr w:type="gramEnd"/>
+      <w:r>
+        <w:rPr>
+          <w:rFonts w:ascii="Times New Roman" w:eastAsia="Times New Roman" w:hAnsi="Times New Roman" w:cs="Times New Roman"/>
+          <w:b/>
+          <w:bCs/>
+          <w:sz w:val="28"/>
+          <w:szCs w:val="28"/>
+        </w:rPr>
+        <w:t xml:space="preserve"> Web</w:t>
+      </w:r>
+      <w:r>
+        <w:rPr>
+          <w:rFonts w:ascii="Times New Roman" w:eastAsia="Times New Roman" w:hAnsi="Times New Roman" w:cs="Times New Roman"/>
+          <w:b/>
+          <w:bCs/>
+          <w:sz w:val="28"/>
+          <w:szCs w:val="28"/>
+        </w:rPr>
+        <w:t xml:space="preserve"> </w:t>
+      </w:r>
+      <w:r>
+        <w:rPr>
+          <w:rFonts w:ascii="Times New Roman" w:eastAsia="Times New Roman" w:hAnsi="Times New Roman" w:cs="Times New Roman"/>
+          <w:b/>
+          <w:bCs/>
+          <w:sz w:val="28"/>
+          <w:szCs w:val="28"/>
+        </w:rPr>
+        <w:t xml:space="preserve">Site </w:t>
+      </w:r>
+      <w:r>
+        <w:rPr>
+          <w:rFonts w:ascii="Times New Roman" w:eastAsia="Times New Roman" w:hAnsi="Times New Roman" w:cs="Times New Roman"/>
+          <w:b/>
+          <w:sz w:val="32"/>
+        </w:rPr>
+        <w:t xml:space="preserve"> –</w:t>
+      </w:r>
+      <w:r>
+        <w:rPr>
+          <w:rFonts w:ascii="Times New Roman" w:eastAsia="Times New Roman" w:hAnsi="Times New Roman" w:cs="Times New Roman"/>
+          <w:b/>
+          <w:sz w:val="32"/>
+        </w:rPr>
+        <w:t xml:space="preserve"> </w:t>
+      </w:r>
+      <w:hyperlink r:id="rId7" w:history="1">
+        <w:r>
+          <w:rPr>
+            <w:rStyle w:val="Hyperlink"/>
+            <w:rFonts w:ascii="Times New Roman" w:eastAsia="Times New Roman" w:hAnsi="Times New Roman" w:cs="Times New Roman"/>
+            <w:b/>
+            <w:sz w:val="32"/>
+          </w:rPr>
+          <w:t>https://workly-home.vercel.app/</w:t>
+        </w:r>
+      </w:hyperlink>
     </w:p>
     <w:p>
       <w:pPr>
@@ -198,67 +503,6 @@
           <w:sz w:val="32"/>
         </w:rPr>
       </w:pPr>
-      <w:r>
-        <w:rPr>
-          <w:rFonts w:ascii="Times New Roman" w:eastAsia="Times New Roman" w:hAnsi="Times New Roman" w:cs="Times New Roman"/>
-          <w:sz w:val="28"/>
-        </w:rPr>
-        <w:t xml:space="preserve"> </w:t>
-      </w:r>
-      <w:r>
-        <w:rPr>
-          <w:rFonts w:ascii="Times New Roman" w:eastAsia="Times New Roman" w:hAnsi="Times New Roman" w:cs="Times New Roman"/>
-          <w:sz w:val="28"/>
-        </w:rPr>
-        <w:tab/>
-      </w:r>
-      <w:r>
-        <w:rPr>
-          <w:rFonts w:ascii="Times New Roman" w:eastAsia="Times New Roman" w:hAnsi="Times New Roman" w:cs="Times New Roman"/>
-          <w:sz w:val="32"/>
-        </w:rPr>
-        <w:t>Module Code:</w:t>
-      </w:r>
-      <w:r>
-        <w:rPr>
-          <w:rFonts w:ascii="Times New Roman" w:eastAsia="Times New Roman" w:hAnsi="Times New Roman" w:cs="Times New Roman"/>
-          <w:b/>
-          <w:sz w:val="32"/>
-        </w:rPr>
-        <w:t xml:space="preserve"> CSC </w:t>
-      </w:r>
-      <w:r>
-        <w:rPr>
-          <w:rFonts w:ascii="Times New Roman" w:eastAsia="Times New Roman" w:hAnsi="Times New Roman" w:cs="Times New Roman"/>
-          <w:b/>
-          <w:sz w:val="32"/>
-        </w:rPr>
-        <w:t>2032</w:t>
-      </w:r>
-      <w:r>
-        <w:rPr>
-          <w:rFonts w:ascii="Times New Roman" w:eastAsia="Times New Roman" w:hAnsi="Times New Roman" w:cs="Times New Roman"/>
-          <w:b/>
-          <w:sz w:val="32"/>
-        </w:rPr>
-        <w:t xml:space="preserve"> – </w:t>
-      </w:r>
-      <w:r>
-        <w:rPr>
-          <w:rFonts w:ascii="Times New Roman" w:eastAsia="Times New Roman" w:hAnsi="Times New Roman" w:cs="Times New Roman"/>
-          <w:b/>
-          <w:sz w:val="32"/>
-        </w:rPr>
-        <w:t>Object Oriented Pro</w:t>
-      </w:r>
-      <w:r>
-        <w:rPr>
-          <w:rFonts w:ascii="Times New Roman" w:eastAsia="Times New Roman" w:hAnsi="Times New Roman" w:cs="Times New Roman"/>
-          <w:b/>
-          <w:sz w:val="32"/>
-        </w:rPr>
-        <w:t xml:space="preserve">gramming  </w:t>
-      </w:r>
     </w:p>
     <w:tbl>
       <w:tblPr>
@@ -368,7 +612,19 @@
               <w:rPr>
                 <w:rFonts w:ascii="Times New Roman" w:hAnsi="Times New Roman" w:cs="Times New Roman"/>
               </w:rPr>
-              <w:t>AS2040514</w:t>
+              <w:t>AS20</w:t>
+            </w:r>
+            <w:r>
+              <w:rPr>
+                <w:rFonts w:ascii="Times New Roman" w:hAnsi="Times New Roman" w:cs="Times New Roman"/>
+              </w:rPr>
+              <w:t>2</w:t>
+            </w:r>
+            <w:r>
+              <w:rPr>
+                <w:rFonts w:ascii="Times New Roman" w:hAnsi="Times New Roman" w:cs="Times New Roman"/>
+              </w:rPr>
+              <w:t>40514</w:t>
             </w:r>
           </w:p>
         </w:tc>
@@ -533,7 +789,9 @@
           <w14:ligatures w14:val="none"/>
         </w:rPr>
       </w:pPr>
-      <w:r>
+    </w:p>
+    <w:p>
+      <w:pPr>
         <w:rPr>
           <w:rFonts w:ascii="Times New Roman" w:eastAsiaTheme="majorEastAsia" w:hAnsi="Times New Roman" w:cs="Times New Roman"/>
           <w:color w:val="2F5496" w:themeColor="accent1" w:themeShade="BF"/>
@@ -542,8 +800,17 @@
           <w:szCs w:val="20"/>
           <w14:ligatures w14:val="none"/>
         </w:rPr>
-        <w:lastRenderedPageBreak/>
-        <w:t>1. Introduction ..................................................................................... 3</w:t>
+      </w:pPr>
+      <w:r>
+        <w:rPr>
+          <w:rFonts w:ascii="Times New Roman" w:eastAsiaTheme="majorEastAsia" w:hAnsi="Times New Roman" w:cs="Times New Roman"/>
+          <w:color w:val="2F5496" w:themeColor="accent1" w:themeShade="BF"/>
+          <w:kern w:val="0"/>
+          <w:sz w:val="36"/>
+          <w:szCs w:val="36"/>
+          <w14:ligatures w14:val="none"/>
+        </w:rPr>
+        <w:t>List Of Content</w:t>
       </w:r>
     </w:p>
     <w:p>
@@ -557,7 +824,9 @@
           <w14:ligatures w14:val="none"/>
         </w:rPr>
       </w:pPr>
-      <w:r>
+    </w:p>
+    <w:p>
+      <w:pPr>
         <w:rPr>
           <w:rFonts w:ascii="Times New Roman" w:eastAsiaTheme="majorEastAsia" w:hAnsi="Times New Roman" w:cs="Times New Roman"/>
           <w:color w:val="2F5496" w:themeColor="accent1" w:themeShade="BF"/>
@@ -566,11 +835,8 @@
           <w:szCs w:val="20"/>
           <w14:ligatures w14:val="none"/>
         </w:rPr>
-        <w:t xml:space="preserve">   1.1 Purpose ...................................................................................... 3</w:t>
-      </w:r>
-    </w:p>
-    <w:p>
-      <w:pPr>
+      </w:pPr>
+      <w:r>
         <w:rPr>
           <w:rFonts w:ascii="Times New Roman" w:eastAsiaTheme="majorEastAsia" w:hAnsi="Times New Roman" w:cs="Times New Roman"/>
           <w:color w:val="2F5496" w:themeColor="accent1" w:themeShade="BF"/>
@@ -579,8 +845,11 @@
           <w:szCs w:val="20"/>
           <w14:ligatures w14:val="none"/>
         </w:rPr>
-      </w:pPr>
-      <w:r>
+        <w:t>1. Introduction .................................................................................... 3</w:t>
+      </w:r>
+    </w:p>
+    <w:p>
+      <w:pPr>
         <w:rPr>
           <w:rFonts w:ascii="Times New Roman" w:eastAsiaTheme="majorEastAsia" w:hAnsi="Times New Roman" w:cs="Times New Roman"/>
           <w:color w:val="2F5496" w:themeColor="accent1" w:themeShade="BF"/>
@@ -589,11 +858,8 @@
           <w:szCs w:val="20"/>
           <w14:ligatures w14:val="none"/>
         </w:rPr>
-        <w:t xml:space="preserve">   1.2 Scope ......................................................................................... 3</w:t>
-      </w:r>
-    </w:p>
-    <w:p>
-      <w:pPr>
+      </w:pPr>
+      <w:r>
         <w:rPr>
           <w:rFonts w:ascii="Times New Roman" w:eastAsiaTheme="majorEastAsia" w:hAnsi="Times New Roman" w:cs="Times New Roman"/>
           <w:color w:val="2F5496" w:themeColor="accent1" w:themeShade="BF"/>
@@ -602,8 +868,11 @@
           <w:szCs w:val="20"/>
           <w14:ligatures w14:val="none"/>
         </w:rPr>
-      </w:pPr>
-      <w:r>
+        <w:t xml:space="preserve">   1.1 Purpose ...................................................................................... 3</w:t>
+      </w:r>
+    </w:p>
+    <w:p>
+      <w:pPr>
         <w:rPr>
           <w:rFonts w:ascii="Times New Roman" w:eastAsiaTheme="majorEastAsia" w:hAnsi="Times New Roman" w:cs="Times New Roman"/>
           <w:color w:val="2F5496" w:themeColor="accent1" w:themeShade="BF"/>
@@ -612,11 +881,8 @@
           <w:szCs w:val="20"/>
           <w14:ligatures w14:val="none"/>
         </w:rPr>
-        <w:t xml:space="preserve">   1.3 Definitions, Acronyms and Abbreviations ............................................... 3</w:t>
-      </w:r>
-    </w:p>
-    <w:p>
-      <w:pPr>
+      </w:pPr>
+      <w:r>
         <w:rPr>
           <w:rFonts w:ascii="Times New Roman" w:eastAsiaTheme="majorEastAsia" w:hAnsi="Times New Roman" w:cs="Times New Roman"/>
           <w:color w:val="2F5496" w:themeColor="accent1" w:themeShade="BF"/>
@@ -625,8 +891,11 @@
           <w:szCs w:val="20"/>
           <w14:ligatures w14:val="none"/>
         </w:rPr>
-      </w:pPr>
-      <w:r>
+        <w:t xml:space="preserve">   1.2 Scope ......................................................................................... 3</w:t>
+      </w:r>
+    </w:p>
+    <w:p>
+      <w:pPr>
         <w:rPr>
           <w:rFonts w:ascii="Times New Roman" w:eastAsiaTheme="majorEastAsia" w:hAnsi="Times New Roman" w:cs="Times New Roman"/>
           <w:color w:val="2F5496" w:themeColor="accent1" w:themeShade="BF"/>
@@ -635,11 +904,8 @@
           <w:szCs w:val="20"/>
           <w14:ligatures w14:val="none"/>
         </w:rPr>
-        <w:t xml:space="preserve">   1.4 References ................................................................................... 4</w:t>
-      </w:r>
-    </w:p>
-    <w:p>
-      <w:pPr>
+      </w:pPr>
+      <w:r>
         <w:rPr>
           <w:rFonts w:ascii="Times New Roman" w:eastAsiaTheme="majorEastAsia" w:hAnsi="Times New Roman" w:cs="Times New Roman"/>
           <w:color w:val="2F5496" w:themeColor="accent1" w:themeShade="BF"/>
@@ -648,8 +914,11 @@
           <w:szCs w:val="20"/>
           <w14:ligatures w14:val="none"/>
         </w:rPr>
-      </w:pPr>
-      <w:r>
+        <w:t xml:space="preserve">   1.3 Definitions, Acronyms and Abbreviations ................................ 3</w:t>
+      </w:r>
+    </w:p>
+    <w:p>
+      <w:pPr>
         <w:rPr>
           <w:rFonts w:ascii="Times New Roman" w:eastAsiaTheme="majorEastAsia" w:hAnsi="Times New Roman" w:cs="Times New Roman"/>
           <w:color w:val="2F5496" w:themeColor="accent1" w:themeShade="BF"/>
@@ -658,11 +927,8 @@
           <w:szCs w:val="20"/>
           <w14:ligatures w14:val="none"/>
         </w:rPr>
-        <w:t xml:space="preserve">   1.5 Document Overview .......................................................................... 4</w:t>
-      </w:r>
-    </w:p>
-    <w:p>
-      <w:pPr>
+      </w:pPr>
+      <w:r>
         <w:rPr>
           <w:rFonts w:ascii="Times New Roman" w:eastAsiaTheme="majorEastAsia" w:hAnsi="Times New Roman" w:cs="Times New Roman"/>
           <w:color w:val="2F5496" w:themeColor="accent1" w:themeShade="BF"/>
@@ -671,7 +937,8 @@
           <w:szCs w:val="20"/>
           <w14:ligatures w14:val="none"/>
         </w:rPr>
-      </w:pPr>
+        <w:t xml:space="preserve">   1.4 References .................................................................................. 4</w:t>
+      </w:r>
     </w:p>
     <w:p>
       <w:pPr>
@@ -693,7 +960,7 @@
           <w:szCs w:val="20"/>
           <w14:ligatures w14:val="none"/>
         </w:rPr>
-        <w:t>2. Overall Description ............................................................................ 5</w:t>
+        <w:t xml:space="preserve">   1.5 Document Overview .................................................................. 4</w:t>
       </w:r>
     </w:p>
     <w:p>
@@ -707,7 +974,9 @@
           <w14:ligatures w14:val="none"/>
         </w:rPr>
       </w:pPr>
-      <w:r>
+    </w:p>
+    <w:p>
+      <w:pPr>
         <w:rPr>
           <w:rFonts w:ascii="Times New Roman" w:eastAsiaTheme="majorEastAsia" w:hAnsi="Times New Roman" w:cs="Times New Roman"/>
           <w:color w:val="2F5496" w:themeColor="accent1" w:themeShade="BF"/>
@@ -716,11 +985,8 @@
           <w:szCs w:val="20"/>
           <w14:ligatures w14:val="none"/>
         </w:rPr>
-        <w:t xml:space="preserve">   2.1 Product Perspective ........................................................................ 5</w:t>
-      </w:r>
-    </w:p>
-    <w:p>
-      <w:pPr>
+      </w:pPr>
+      <w:r>
         <w:rPr>
           <w:rFonts w:ascii="Times New Roman" w:eastAsiaTheme="majorEastAsia" w:hAnsi="Times New Roman" w:cs="Times New Roman"/>
           <w:color w:val="2F5496" w:themeColor="accent1" w:themeShade="BF"/>
@@ -729,8 +995,11 @@
           <w:szCs w:val="20"/>
           <w14:ligatures w14:val="none"/>
         </w:rPr>
-      </w:pPr>
-      <w:r>
+        <w:t>2. Overall Description ............................................................................ 5</w:t>
+      </w:r>
+    </w:p>
+    <w:p>
+      <w:pPr>
         <w:rPr>
           <w:rFonts w:ascii="Times New Roman" w:eastAsiaTheme="majorEastAsia" w:hAnsi="Times New Roman" w:cs="Times New Roman"/>
           <w:color w:val="2F5496" w:themeColor="accent1" w:themeShade="BF"/>
@@ -739,11 +1008,8 @@
           <w:szCs w:val="20"/>
           <w14:ligatures w14:val="none"/>
         </w:rPr>
-        <w:t xml:space="preserve">   2.2 Product Functions .......................................................................... 5</w:t>
-      </w:r>
-    </w:p>
-    <w:p>
-      <w:pPr>
+      </w:pPr>
+      <w:r>
         <w:rPr>
           <w:rFonts w:ascii="Times New Roman" w:eastAsiaTheme="majorEastAsia" w:hAnsi="Times New Roman" w:cs="Times New Roman"/>
           <w:color w:val="2F5496" w:themeColor="accent1" w:themeShade="BF"/>
@@ -752,8 +1018,11 @@
           <w:szCs w:val="20"/>
           <w14:ligatures w14:val="none"/>
         </w:rPr>
-      </w:pPr>
-      <w:r>
+        <w:t xml:space="preserve">   2.1 Product Perspective ........................................................................ 5</w:t>
+      </w:r>
+    </w:p>
+    <w:p>
+      <w:pPr>
         <w:rPr>
           <w:rFonts w:ascii="Times New Roman" w:eastAsiaTheme="majorEastAsia" w:hAnsi="Times New Roman" w:cs="Times New Roman"/>
           <w:color w:val="2F5496" w:themeColor="accent1" w:themeShade="BF"/>
@@ -762,11 +1031,8 @@
           <w:szCs w:val="20"/>
           <w14:ligatures w14:val="none"/>
         </w:rPr>
-        <w:t xml:space="preserve">   2.3 User Classes and Characteristics ................................................... 6</w:t>
-      </w:r>
-    </w:p>
-    <w:p>
-      <w:pPr>
+      </w:pPr>
+      <w:r>
         <w:rPr>
           <w:rFonts w:ascii="Times New Roman" w:eastAsiaTheme="majorEastAsia" w:hAnsi="Times New Roman" w:cs="Times New Roman"/>
           <w:color w:val="2F5496" w:themeColor="accent1" w:themeShade="BF"/>
@@ -775,8 +1041,11 @@
           <w:szCs w:val="20"/>
           <w14:ligatures w14:val="none"/>
         </w:rPr>
-      </w:pPr>
-      <w:r>
+        <w:t xml:space="preserve">   2.2 Product Functions .......................................................................... 5</w:t>
+      </w:r>
+    </w:p>
+    <w:p>
+      <w:pPr>
         <w:rPr>
           <w:rFonts w:ascii="Times New Roman" w:eastAsiaTheme="majorEastAsia" w:hAnsi="Times New Roman" w:cs="Times New Roman"/>
           <w:color w:val="2F5496" w:themeColor="accent1" w:themeShade="BF"/>
@@ -785,11 +1054,8 @@
           <w:szCs w:val="20"/>
           <w14:ligatures w14:val="none"/>
         </w:rPr>
-        <w:t xml:space="preserve">   2.4 Operating Environment ..................................................................... 6</w:t>
-      </w:r>
-    </w:p>
-    <w:p>
-      <w:pPr>
+      </w:pPr>
+      <w:r>
         <w:rPr>
           <w:rFonts w:ascii="Times New Roman" w:eastAsiaTheme="majorEastAsia" w:hAnsi="Times New Roman" w:cs="Times New Roman"/>
           <w:color w:val="2F5496" w:themeColor="accent1" w:themeShade="BF"/>
@@ -798,8 +1064,11 @@
           <w:szCs w:val="20"/>
           <w14:ligatures w14:val="none"/>
         </w:rPr>
-      </w:pPr>
-      <w:r>
+        <w:t xml:space="preserve">   2.3 User Classes and Characteristics ................................................... 6</w:t>
+      </w:r>
+    </w:p>
+    <w:p>
+      <w:pPr>
         <w:rPr>
           <w:rFonts w:ascii="Times New Roman" w:eastAsiaTheme="majorEastAsia" w:hAnsi="Times New Roman" w:cs="Times New Roman"/>
           <w:color w:val="2F5496" w:themeColor="accent1" w:themeShade="BF"/>
@@ -808,11 +1077,8 @@
           <w:szCs w:val="20"/>
           <w14:ligatures w14:val="none"/>
         </w:rPr>
-        <w:t xml:space="preserve">   2.5 Design Constraints ......................................................................... 7</w:t>
-      </w:r>
-    </w:p>
-    <w:p>
-      <w:pPr>
+      </w:pPr>
+      <w:r>
         <w:rPr>
           <w:rFonts w:ascii="Times New Roman" w:eastAsiaTheme="majorEastAsia" w:hAnsi="Times New Roman" w:cs="Times New Roman"/>
           <w:color w:val="2F5496" w:themeColor="accent1" w:themeShade="BF"/>
@@ -821,8 +1087,11 @@
           <w:szCs w:val="20"/>
           <w14:ligatures w14:val="none"/>
         </w:rPr>
-      </w:pPr>
-      <w:r>
+        <w:t xml:space="preserve">   2.4 Operating Environment ................................................................. 6</w:t>
+      </w:r>
+    </w:p>
+    <w:p>
+      <w:pPr>
         <w:rPr>
           <w:rFonts w:ascii="Times New Roman" w:eastAsiaTheme="majorEastAsia" w:hAnsi="Times New Roman" w:cs="Times New Roman"/>
           <w:color w:val="2F5496" w:themeColor="accent1" w:themeShade="BF"/>
@@ -831,11 +1100,8 @@
           <w:szCs w:val="20"/>
           <w14:ligatures w14:val="none"/>
         </w:rPr>
-        <w:t xml:space="preserve">   2.6 Assumptions and Dependencies ........................................................ 7</w:t>
-      </w:r>
-    </w:p>
-    <w:p>
-      <w:pPr>
+      </w:pPr>
+      <w:r>
         <w:rPr>
           <w:rFonts w:ascii="Times New Roman" w:eastAsiaTheme="majorEastAsia" w:hAnsi="Times New Roman" w:cs="Times New Roman"/>
           <w:color w:val="2F5496" w:themeColor="accent1" w:themeShade="BF"/>
@@ -844,7 +1110,8 @@
           <w:szCs w:val="20"/>
           <w14:ligatures w14:val="none"/>
         </w:rPr>
-      </w:pPr>
+        <w:t xml:space="preserve">   2.5 Design Constraints ......................................................................... 7</w:t>
+      </w:r>
     </w:p>
     <w:p>
       <w:pPr>
@@ -866,7 +1133,7 @@
           <w:szCs w:val="20"/>
           <w14:ligatures w14:val="none"/>
         </w:rPr>
-        <w:t>3. System Requirements ............................................................................ 8</w:t>
+        <w:t xml:space="preserve">   2.6 Assumptions and Dependencies ..................................................... 7</w:t>
       </w:r>
     </w:p>
     <w:p>
@@ -880,7 +1147,9 @@
           <w14:ligatures w14:val="none"/>
         </w:rPr>
       </w:pPr>
-      <w:r>
+    </w:p>
+    <w:p>
+      <w:pPr>
         <w:rPr>
           <w:rFonts w:ascii="Times New Roman" w:eastAsiaTheme="majorEastAsia" w:hAnsi="Times New Roman" w:cs="Times New Roman"/>
           <w:color w:val="2F5496" w:themeColor="accent1" w:themeShade="BF"/>
@@ -889,11 +1158,8 @@
           <w:szCs w:val="20"/>
           <w14:ligatures w14:val="none"/>
         </w:rPr>
-        <w:t xml:space="preserve">   3.1 Functional Requirements .................................................................. 8</w:t>
-      </w:r>
-    </w:p>
-    <w:p>
-      <w:pPr>
+      </w:pPr>
+      <w:r>
         <w:rPr>
           <w:rFonts w:ascii="Times New Roman" w:eastAsiaTheme="majorEastAsia" w:hAnsi="Times New Roman" w:cs="Times New Roman"/>
           <w:color w:val="2F5496" w:themeColor="accent1" w:themeShade="BF"/>
@@ -902,8 +1168,11 @@
           <w:szCs w:val="20"/>
           <w14:ligatures w14:val="none"/>
         </w:rPr>
-      </w:pPr>
-      <w:r>
+        <w:t>3. System Requirements ............................................................................ 8</w:t>
+      </w:r>
+    </w:p>
+    <w:p>
+      <w:pPr>
         <w:rPr>
           <w:rFonts w:ascii="Times New Roman" w:eastAsiaTheme="majorEastAsia" w:hAnsi="Times New Roman" w:cs="Times New Roman"/>
           <w:color w:val="2F5496" w:themeColor="accent1" w:themeShade="BF"/>
@@ -912,11 +1181,8 @@
           <w:szCs w:val="20"/>
           <w14:ligatures w14:val="none"/>
         </w:rPr>
-        <w:t xml:space="preserve">   3.2 Non-Functional Requirements ......................................................... 11</w:t>
-      </w:r>
-    </w:p>
-    <w:p>
-      <w:pPr>
+      </w:pPr>
+      <w:r>
         <w:rPr>
           <w:rFonts w:ascii="Times New Roman" w:eastAsiaTheme="majorEastAsia" w:hAnsi="Times New Roman" w:cs="Times New Roman"/>
           <w:color w:val="2F5496" w:themeColor="accent1" w:themeShade="BF"/>
@@ -925,7 +1191,8 @@
           <w:szCs w:val="20"/>
           <w14:ligatures w14:val="none"/>
         </w:rPr>
-      </w:pPr>
+        <w:t xml:space="preserve">   3.1 Functional Requirements .................................................................. 8</w:t>
+      </w:r>
     </w:p>
     <w:p>
       <w:pPr>
@@ -947,7 +1214,7 @@
           <w:szCs w:val="20"/>
           <w14:ligatures w14:val="none"/>
         </w:rPr>
-        <w:t>4. UML Diagrams ..................................................................................... 13</w:t>
+        <w:t xml:space="preserve">   3.2 Non-Functional Requirements ......................................................... 11</w:t>
       </w:r>
     </w:p>
     <w:p>
@@ -961,7 +1228,9 @@
           <w14:ligatures w14:val="none"/>
         </w:rPr>
       </w:pPr>
-      <w:r>
+    </w:p>
+    <w:p>
+      <w:pPr>
         <w:rPr>
           <w:rFonts w:ascii="Times New Roman" w:eastAsiaTheme="majorEastAsia" w:hAnsi="Times New Roman" w:cs="Times New Roman"/>
           <w:color w:val="2F5496" w:themeColor="accent1" w:themeShade="BF"/>
@@ -970,11 +1239,8 @@
           <w:szCs w:val="20"/>
           <w14:ligatures w14:val="none"/>
         </w:rPr>
-        <w:t xml:space="preserve">   4.1 Use Case Diagram ........................................................................... 13</w:t>
-      </w:r>
-    </w:p>
-    <w:p>
-      <w:pPr>
+      </w:pPr>
+      <w:r>
         <w:rPr>
           <w:rFonts w:ascii="Times New Roman" w:eastAsiaTheme="majorEastAsia" w:hAnsi="Times New Roman" w:cs="Times New Roman"/>
           <w:color w:val="2F5496" w:themeColor="accent1" w:themeShade="BF"/>
@@ -983,8 +1249,11 @@
           <w:szCs w:val="20"/>
           <w14:ligatures w14:val="none"/>
         </w:rPr>
-      </w:pPr>
-      <w:r>
+        <w:t>4. UML Diagrams ..................................................................................... 13</w:t>
+      </w:r>
+    </w:p>
+    <w:p>
+      <w:pPr>
         <w:rPr>
           <w:rFonts w:ascii="Times New Roman" w:eastAsiaTheme="majorEastAsia" w:hAnsi="Times New Roman" w:cs="Times New Roman"/>
           <w:color w:val="2F5496" w:themeColor="accent1" w:themeShade="BF"/>
@@ -993,11 +1262,8 @@
           <w:szCs w:val="20"/>
           <w14:ligatures w14:val="none"/>
         </w:rPr>
-        <w:t xml:space="preserve">   4.2 Class Diagram ............................................................................... 14</w:t>
-      </w:r>
-    </w:p>
-    <w:p>
-      <w:pPr>
+      </w:pPr>
+      <w:r>
         <w:rPr>
           <w:rFonts w:ascii="Times New Roman" w:eastAsiaTheme="majorEastAsia" w:hAnsi="Times New Roman" w:cs="Times New Roman"/>
           <w:color w:val="2F5496" w:themeColor="accent1" w:themeShade="BF"/>
@@ -1006,8 +1272,11 @@
           <w:szCs w:val="20"/>
           <w14:ligatures w14:val="none"/>
         </w:rPr>
-      </w:pPr>
-      <w:r>
+        <w:t xml:space="preserve">   4.1 Use Case Diagram ........................................................................... 13</w:t>
+      </w:r>
+    </w:p>
+    <w:p>
+      <w:pPr>
         <w:rPr>
           <w:rFonts w:ascii="Times New Roman" w:eastAsiaTheme="majorEastAsia" w:hAnsi="Times New Roman" w:cs="Times New Roman"/>
           <w:color w:val="2F5496" w:themeColor="accent1" w:themeShade="BF"/>
@@ -1016,11 +1285,8 @@
           <w:szCs w:val="20"/>
           <w14:ligatures w14:val="none"/>
         </w:rPr>
-        <w:t xml:space="preserve">   4.3 Sequence Diagram ............................................................................ 15</w:t>
-      </w:r>
-    </w:p>
-    <w:p>
-      <w:pPr>
+      </w:pPr>
+      <w:r>
         <w:rPr>
           <w:rFonts w:ascii="Times New Roman" w:eastAsiaTheme="majorEastAsia" w:hAnsi="Times New Roman" w:cs="Times New Roman"/>
           <w:color w:val="2F5496" w:themeColor="accent1" w:themeShade="BF"/>
@@ -1029,7 +1295,8 @@
           <w:szCs w:val="20"/>
           <w14:ligatures w14:val="none"/>
         </w:rPr>
-      </w:pPr>
+        <w:t xml:space="preserve">   4.2 Class Diagram .......................................................................</w:t>
+      </w:r>
       <w:r>
         <w:rPr>
           <w:rFonts w:ascii="Times New Roman" w:eastAsiaTheme="majorEastAsia" w:hAnsi="Times New Roman" w:cs="Times New Roman"/>
@@ -1039,11 +1306,9 @@
           <w:szCs w:val="20"/>
           <w14:ligatures w14:val="none"/>
         </w:rPr>
-        <w:t xml:space="preserve">   4.4 Activity Diagram ............................................................................ 16</w:t>
-      </w:r>
-    </w:p>
-    <w:p>
-      <w:pPr>
+        <w:t>...</w:t>
+      </w:r>
+      <w:r>
         <w:rPr>
           <w:rFonts w:ascii="Times New Roman" w:eastAsiaTheme="majorEastAsia" w:hAnsi="Times New Roman" w:cs="Times New Roman"/>
           <w:color w:val="2F5496" w:themeColor="accent1" w:themeShade="BF"/>
@@ -1052,7 +1317,8 @@
           <w:szCs w:val="20"/>
           <w14:ligatures w14:val="none"/>
         </w:rPr>
-      </w:pPr>
+        <w:t>........ 14</w:t>
+      </w:r>
     </w:p>
     <w:p>
       <w:pPr>
@@ -1074,7 +1340,7 @@
           <w:szCs w:val="20"/>
           <w14:ligatures w14:val="none"/>
         </w:rPr>
-        <w:t>5. Future Enhancements ............................................................................ 17</w:t>
+        <w:t xml:space="preserve">   4.3 Sequence Diagram ........................................................................... 15</w:t>
       </w:r>
     </w:p>
     <w:p>
@@ -1088,9 +1354,7 @@
           <w14:ligatures w14:val="none"/>
         </w:rPr>
       </w:pPr>
-    </w:p>
-    <w:p>
-      <w:pPr>
+      <w:r>
         <w:rPr>
           <w:rFonts w:ascii="Times New Roman" w:eastAsiaTheme="majorEastAsia" w:hAnsi="Times New Roman" w:cs="Times New Roman"/>
           <w:color w:val="2F5496" w:themeColor="accent1" w:themeShade="BF"/>
@@ -1099,7 +1363,8 @@
           <w:szCs w:val="20"/>
           <w14:ligatures w14:val="none"/>
         </w:rPr>
-      </w:pPr>
+        <w:t xml:space="preserve">   4.4 Activity Diagram .............................................</w:t>
+      </w:r>
       <w:r>
         <w:rPr>
           <w:rFonts w:ascii="Times New Roman" w:eastAsiaTheme="majorEastAsia" w:hAnsi="Times New Roman" w:cs="Times New Roman"/>
@@ -1109,7 +1374,110 @@
           <w:szCs w:val="20"/>
           <w14:ligatures w14:val="none"/>
         </w:rPr>
-        <w:t>6. Conclusion ......................................................................................... 18</w:t>
+        <w:t>.....</w:t>
+      </w:r>
+      <w:r>
+        <w:rPr>
+          <w:rFonts w:ascii="Times New Roman" w:eastAsiaTheme="majorEastAsia" w:hAnsi="Times New Roman" w:cs="Times New Roman"/>
+          <w:color w:val="2F5496" w:themeColor="accent1" w:themeShade="BF"/>
+          <w:kern w:val="0"/>
+          <w:sz w:val="20"/>
+          <w:szCs w:val="20"/>
+          <w14:ligatures w14:val="none"/>
+        </w:rPr>
+        <w:t>........................... 16</w:t>
+      </w:r>
+    </w:p>
+    <w:p>
+      <w:pPr>
+        <w:rPr>
+          <w:rFonts w:ascii="Times New Roman" w:eastAsiaTheme="majorEastAsia" w:hAnsi="Times New Roman" w:cs="Times New Roman"/>
+          <w:color w:val="2F5496" w:themeColor="accent1" w:themeShade="BF"/>
+          <w:kern w:val="0"/>
+          <w:sz w:val="20"/>
+          <w:szCs w:val="20"/>
+          <w14:ligatures w14:val="none"/>
+        </w:rPr>
+      </w:pPr>
+    </w:p>
+    <w:p>
+      <w:pPr>
+        <w:rPr>
+          <w:rFonts w:ascii="Times New Roman" w:eastAsiaTheme="majorEastAsia" w:hAnsi="Times New Roman" w:cs="Times New Roman"/>
+          <w:color w:val="2F5496" w:themeColor="accent1" w:themeShade="BF"/>
+          <w:kern w:val="0"/>
+          <w:sz w:val="20"/>
+          <w:szCs w:val="20"/>
+          <w14:ligatures w14:val="none"/>
+        </w:rPr>
+      </w:pPr>
+      <w:r>
+        <w:rPr>
+          <w:rFonts w:ascii="Times New Roman" w:eastAsiaTheme="majorEastAsia" w:hAnsi="Times New Roman" w:cs="Times New Roman"/>
+          <w:color w:val="2F5496" w:themeColor="accent1" w:themeShade="BF"/>
+          <w:kern w:val="0"/>
+          <w:sz w:val="20"/>
+          <w:szCs w:val="20"/>
+          <w14:ligatures w14:val="none"/>
+        </w:rPr>
+        <w:t>5. Future Enhancements ............................................................................ 17</w:t>
+      </w:r>
+    </w:p>
+    <w:p>
+      <w:pPr>
+        <w:rPr>
+          <w:rFonts w:ascii="Times New Roman" w:eastAsiaTheme="majorEastAsia" w:hAnsi="Times New Roman" w:cs="Times New Roman"/>
+          <w:color w:val="2F5496" w:themeColor="accent1" w:themeShade="BF"/>
+          <w:kern w:val="0"/>
+          <w:sz w:val="20"/>
+          <w:szCs w:val="20"/>
+          <w14:ligatures w14:val="none"/>
+        </w:rPr>
+      </w:pPr>
+    </w:p>
+    <w:p>
+      <w:pPr>
+        <w:rPr>
+          <w:rFonts w:ascii="Times New Roman" w:eastAsiaTheme="majorEastAsia" w:hAnsi="Times New Roman" w:cs="Times New Roman"/>
+          <w:color w:val="2F5496" w:themeColor="accent1" w:themeShade="BF"/>
+          <w:kern w:val="0"/>
+          <w:sz w:val="20"/>
+          <w:szCs w:val="20"/>
+          <w14:ligatures w14:val="none"/>
+        </w:rPr>
+      </w:pPr>
+      <w:r>
+        <w:rPr>
+          <w:rFonts w:ascii="Times New Roman" w:eastAsiaTheme="majorEastAsia" w:hAnsi="Times New Roman" w:cs="Times New Roman"/>
+          <w:color w:val="2F5496" w:themeColor="accent1" w:themeShade="BF"/>
+          <w:kern w:val="0"/>
+          <w:sz w:val="20"/>
+          <w:szCs w:val="20"/>
+          <w14:ligatures w14:val="none"/>
+        </w:rPr>
+        <w:t>6. Conclusion .......................................................................</w:t>
+      </w:r>
+      <w:r>
+        <w:rPr>
+          <w:rFonts w:ascii="Times New Roman" w:eastAsiaTheme="majorEastAsia" w:hAnsi="Times New Roman" w:cs="Times New Roman"/>
+          <w:color w:val="2F5496" w:themeColor="accent1" w:themeShade="BF"/>
+          <w:kern w:val="0"/>
+          <w:sz w:val="20"/>
+          <w:szCs w:val="20"/>
+          <w14:ligatures w14:val="none"/>
+        </w:rPr>
+        <w:t>....</w:t>
+      </w:r>
+      <w:r>
+        <w:rPr>
+          <w:rFonts w:ascii="Times New Roman" w:eastAsiaTheme="majorEastAsia" w:hAnsi="Times New Roman" w:cs="Times New Roman"/>
+          <w:color w:val="2F5496" w:themeColor="accent1" w:themeShade="BF"/>
+          <w:kern w:val="0"/>
+          <w:sz w:val="20"/>
+          <w:szCs w:val="20"/>
+          <w14:ligatures w14:val="none"/>
+        </w:rPr>
+        <w:t>.................. 18</w:t>
       </w:r>
     </w:p>
     <w:p>
@@ -1142,7 +1510,29 @@
           <w:szCs w:val="20"/>
           <w14:ligatures w14:val="none"/>
         </w:rPr>
-        <w:t>7. References ......................................................................................... 19</w:t>
+        <w:t>7. References ......................................................................</w:t>
+      </w:r>
+      <w:r>
+        <w:rPr>
+          <w:rFonts w:ascii="Times New Roman" w:eastAsiaTheme="majorEastAsia" w:hAnsi="Times New Roman" w:cs="Times New Roman"/>
+          <w:color w:val="2F5496" w:themeColor="accent1" w:themeShade="BF"/>
+          <w:kern w:val="0"/>
+          <w:sz w:val="20"/>
+          <w:szCs w:val="20"/>
+          <w14:ligatures w14:val="none"/>
+        </w:rPr>
+        <w:t>.....</w:t>
+      </w:r>
+      <w:r>
+        <w:rPr>
+          <w:rFonts w:ascii="Times New Roman" w:eastAsiaTheme="majorEastAsia" w:hAnsi="Times New Roman" w:cs="Times New Roman"/>
+          <w:color w:val="2F5496" w:themeColor="accent1" w:themeShade="BF"/>
+          <w:kern w:val="0"/>
+          <w:sz w:val="20"/>
+          <w:szCs w:val="20"/>
+          <w14:ligatures w14:val="none"/>
+        </w:rPr>
+        <w:t>.................. 19</w:t>
       </w:r>
     </w:p>
     <w:p>
@@ -1164,21 +1554,16 @@
           <w:szCs w:val="40"/>
         </w:rPr>
       </w:pPr>
-      <w:r>
+    </w:p>
+    <w:p>
+      <w:pPr>
         <w:rPr>
           <w:rFonts w:ascii="Times New Roman" w:eastAsiaTheme="majorEastAsia" w:hAnsi="Times New Roman" w:cs="Times New Roman"/>
           <w:color w:val="2F5496" w:themeColor="accent1" w:themeShade="BF"/>
           <w:sz w:val="40"/>
           <w:szCs w:val="40"/>
         </w:rPr>
-        <w:t>1.</w:t>
-      </w:r>
-      <w:r>
-        <w:rPr>
-          <w:rFonts w:ascii="Times New Roman" w:hAnsi="Times New Roman" w:cs="Times New Roman"/>
-        </w:rPr>
-        <w:t xml:space="preserve"> </w:t>
-      </w:r>
+      </w:pPr>
       <w:r>
         <w:rPr>
           <w:rFonts w:ascii="Times New Roman" w:eastAsiaTheme="majorEastAsia" w:hAnsi="Times New Roman" w:cs="Times New Roman"/>
@@ -1186,6 +1571,21 @@
           <w:sz w:val="40"/>
           <w:szCs w:val="40"/>
         </w:rPr>
+        <w:t>1.</w:t>
+      </w:r>
+      <w:r>
+        <w:rPr>
+          <w:rFonts w:ascii="Times New Roman" w:hAnsi="Times New Roman" w:cs="Times New Roman"/>
+        </w:rPr>
+        <w:t xml:space="preserve"> </w:t>
+      </w:r>
+      <w:r>
+        <w:rPr>
+          <w:rFonts w:ascii="Times New Roman" w:eastAsiaTheme="majorEastAsia" w:hAnsi="Times New Roman" w:cs="Times New Roman"/>
+          <w:color w:val="2F5496" w:themeColor="accent1" w:themeShade="BF"/>
+          <w:sz w:val="40"/>
+          <w:szCs w:val="40"/>
+        </w:rPr>
         <w:t>Introduction</w:t>
       </w:r>
     </w:p>
@@ -1199,7 +1599,6 @@
         <w:rPr>
           <w:rFonts w:ascii="Times New Roman" w:hAnsi="Times New Roman" w:cs="Times New Roman"/>
         </w:rPr>
-        <w:lastRenderedPageBreak/>
         <w:t>1.1 Purpose</w:t>
       </w:r>
     </w:p>
@@ -1465,6 +1864,7 @@
           <w:sz w:val="28"/>
           <w:szCs w:val="28"/>
         </w:rPr>
+        <w:lastRenderedPageBreak/>
         <w:t>The current scope of the project focuses on service discovery, booking management, user management, membership management, and administrative functions. Advanced features such as online payment processing, real-time messaging, GPS tracking, and mobile applications are considered future enhancements and are not included in the current version of the system.</w:t>
       </w:r>
     </w:p>
@@ -1540,7 +1940,6 @@
                 <w:b/>
                 <w:bCs/>
               </w:rPr>
-              <w:lastRenderedPageBreak/>
               <w:t>Term / Acronym</w:t>
             </w:r>
           </w:p>
@@ -2340,6 +2739,7 @@
         <w:rPr>
           <w:rFonts w:ascii="Times New Roman" w:hAnsi="Times New Roman" w:cs="Times New Roman"/>
         </w:rPr>
+        <w:lastRenderedPageBreak/>
         <w:t>1.4 References</w:t>
       </w:r>
     </w:p>
@@ -2388,7 +2788,6 @@
         <w:rPr>
           <w:rFonts w:ascii="Times New Roman" w:hAnsi="Times New Roman" w:cs="Times New Roman"/>
         </w:rPr>
-        <w:lastRenderedPageBreak/>
         <w:t>[2] React Documentation. Available: https://react.dev/</w:t>
       </w:r>
     </w:p>
@@ -2475,7 +2874,7 @@
         </w:rPr>
         <w:t xml:space="preserve">[8] JSON Web Token (JWT). Available: </w:t>
       </w:r>
-      <w:hyperlink r:id="rId7" w:history="1">
+      <w:hyperlink r:id="rId8" w:history="1">
         <w:r>
           <w:rPr>
             <w:rStyle w:val="Hyperlink"/>
@@ -2658,14 +3057,6 @@
           <w:szCs w:val="32"/>
         </w:rPr>
       </w:pPr>
-      <w:r>
-        <w:rPr>
-          <w:rFonts w:ascii="Times New Roman" w:hAnsi="Times New Roman" w:cs="Times New Roman"/>
-          <w:sz w:val="32"/>
-          <w:szCs w:val="32"/>
-        </w:rPr>
-        <w:t>2. Overall Description</w:t>
-      </w:r>
     </w:p>
     <w:p>
       <w:pPr>
@@ -2674,18 +3065,10 @@
         </w:tabs>
         <w:rPr>
           <w:rFonts w:ascii="Times New Roman" w:hAnsi="Times New Roman" w:cs="Times New Roman"/>
-          <w:sz w:val="28"/>
-          <w:szCs w:val="28"/>
-        </w:rPr>
-      </w:pPr>
-      <w:r>
-        <w:rPr>
-          <w:rFonts w:ascii="Times New Roman" w:hAnsi="Times New Roman" w:cs="Times New Roman"/>
-          <w:sz w:val="28"/>
-          <w:szCs w:val="28"/>
-        </w:rPr>
-        <w:t>2.1 Product Perspective</w:t>
-      </w:r>
+          <w:sz w:val="32"/>
+          <w:szCs w:val="32"/>
+        </w:rPr>
+      </w:pPr>
     </w:p>
     <w:p>
       <w:pPr>
@@ -2694,17 +3077,18 @@
         </w:tabs>
         <w:rPr>
           <w:rFonts w:ascii="Times New Roman" w:hAnsi="Times New Roman" w:cs="Times New Roman"/>
-          <w:sz w:val="28"/>
-          <w:szCs w:val="28"/>
-        </w:rPr>
-      </w:pPr>
-      <w:r>
-        <w:rPr>
-          <w:rFonts w:ascii="Times New Roman" w:hAnsi="Times New Roman" w:cs="Times New Roman"/>
-          <w:sz w:val="28"/>
-          <w:szCs w:val="28"/>
-        </w:rPr>
-        <w:t>Workly is a web-based home service provider platform designed to simplify the process of connecting customers with skilled service professionals. The system acts as an online marketplace where customers can search for service providers, view their profiles, make bookings, and manage service requests efficiently.</w:t>
+          <w:sz w:val="32"/>
+          <w:szCs w:val="32"/>
+        </w:rPr>
+      </w:pPr>
+      <w:r>
+        <w:rPr>
+          <w:rFonts w:ascii="Times New Roman" w:hAnsi="Times New Roman" w:cs="Times New Roman"/>
+          <w:sz w:val="32"/>
+          <w:szCs w:val="32"/>
+        </w:rPr>
+        <w:lastRenderedPageBreak/>
+        <w:t>2. Overall Description</w:t>
       </w:r>
     </w:p>
     <w:p>
@@ -2718,6 +3102,14 @@
           <w:szCs w:val="28"/>
         </w:rPr>
       </w:pPr>
+      <w:r>
+        <w:rPr>
+          <w:rFonts w:ascii="Times New Roman" w:hAnsi="Times New Roman" w:cs="Times New Roman"/>
+          <w:sz w:val="28"/>
+          <w:szCs w:val="28"/>
+        </w:rPr>
+        <w:t>2.1 Product Perspective</w:t>
+      </w:r>
     </w:p>
     <w:p>
       <w:pPr>
@@ -2736,8 +3128,7 @@
           <w:sz w:val="28"/>
           <w:szCs w:val="28"/>
         </w:rPr>
-        <w:lastRenderedPageBreak/>
-        <w:t>The platform supports three primary user roles: Customer, Service Provider, and Administrator. Customers can browse available services, book appointments, and provide ratings and reviews. Service providers can manage their profiles, list their services, respond to booking requests, and monitor their bookings. Administrators oversee the entire platform by managing users, memberships, bookings, and system operations.</w:t>
+        <w:t>Workly is a web-based home service provider platform designed to simplify the process of connecting customers with skilled service professionals. The system acts as an online marketplace where customers can search for service providers, view their profiles, make bookings, and manage service requests efficiently.</w:t>
       </w:r>
     </w:p>
     <w:p>
@@ -2769,7 +3160,7 @@
           <w:sz w:val="28"/>
           <w:szCs w:val="28"/>
         </w:rPr>
-        <w:t>Workly is developed using a modern three-tier architecture. The frontend is built with React to provide a responsive and user-friendly interface. The backend is developed using Spring Boot, which handles business logic and RESTful APIs. MongoDB is used as the database to store user information, service details, bookings, memberships, and reviews.</w:t>
+        <w:t>The platform supports three primary user roles: Customer, Service Provider, and Administrator. Customers can browse available services, book appointments, and provide ratings and reviews. Service providers can manage their profiles, list their services, respond to booking requests, and monitor their bookings. Administrators oversee the entire platform by managing users, memberships, bookings, and system operations.</w:t>
       </w:r>
     </w:p>
     <w:p>
@@ -2801,7 +3192,7 @@
           <w:sz w:val="28"/>
           <w:szCs w:val="28"/>
         </w:rPr>
-        <w:t>The system is designed to be scalable, secure, and easy to maintain, allowing new features and services to be added in future versions without significant changes to the existing architecture.</w:t>
+        <w:t>Workly is developed using a modern three-tier architecture. The frontend is built with React to provide a responsive and user-friendly interface. The backend is developed using Spring Boot, which handles business logic and RESTful APIs. MongoDB is used as the database to store user information, service details, bookings, memberships, and reviews.</w:t>
       </w:r>
     </w:p>
     <w:p>
@@ -2833,7 +3224,7 @@
           <w:sz w:val="28"/>
           <w:szCs w:val="28"/>
         </w:rPr>
-        <w:t>2.2 Product Functions</w:t>
+        <w:t>The system is designed to be scalable, secure, and easy to maintain, allowing new features and services to be added in future versions without significant changes to the existing architecture.</w:t>
       </w:r>
     </w:p>
     <w:p>
@@ -2847,14 +3238,6 @@
           <w:szCs w:val="28"/>
         </w:rPr>
       </w:pPr>
-      <w:r>
-        <w:rPr>
-          <w:rFonts w:ascii="Times New Roman" w:hAnsi="Times New Roman" w:cs="Times New Roman"/>
-          <w:sz w:val="28"/>
-          <w:szCs w:val="28"/>
-        </w:rPr>
-        <w:t>The Workly – Home Service Provider Platform provides a comprehensive set of features to simplify the process of connecting customers with professional service providers. The main functions of the system are as follows:</w:t>
-      </w:r>
     </w:p>
     <w:p>
       <w:pPr>
@@ -2873,7 +3256,7 @@
           <w:sz w:val="28"/>
           <w:szCs w:val="28"/>
         </w:rPr>
-        <w:t>• User Registration and Authentication</w:t>
+        <w:t>2.2 Product Functions</w:t>
       </w:r>
     </w:p>
     <w:p>
@@ -2893,7 +3276,7 @@
           <w:sz w:val="28"/>
           <w:szCs w:val="28"/>
         </w:rPr>
-        <w:t xml:space="preserve">  - Allows customers and service providers to create accounts and securely log in using authenticated credentials.</w:t>
+        <w:t>The Workly – Home Service Provider Platform provides a comprehensive set of features to simplify the process of connecting customers with professional service providers. The main functions of the system are as follows:</w:t>
       </w:r>
     </w:p>
     <w:p>
@@ -2913,7 +3296,7 @@
           <w:sz w:val="28"/>
           <w:szCs w:val="28"/>
         </w:rPr>
-        <w:t>• User Profile Management</w:t>
+        <w:t>• User Registration and Authentication</w:t>
       </w:r>
     </w:p>
     <w:p>
@@ -2933,7 +3316,7 @@
           <w:sz w:val="28"/>
           <w:szCs w:val="28"/>
         </w:rPr>
-        <w:t xml:space="preserve">  - Enables users to view, update, and manage their personal information and account details.</w:t>
+        <w:t xml:space="preserve">  - Allows customers and service providers to create accounts and securely log in using authenticated credentials.</w:t>
       </w:r>
     </w:p>
     <w:p>
@@ -2953,7 +3336,7 @@
           <w:sz w:val="28"/>
           <w:szCs w:val="28"/>
         </w:rPr>
-        <w:t>• Service Management</w:t>
+        <w:t>• User Profile Management</w:t>
       </w:r>
     </w:p>
     <w:p>
@@ -2973,7 +3356,7 @@
           <w:sz w:val="28"/>
           <w:szCs w:val="28"/>
         </w:rPr>
-        <w:t xml:space="preserve">  - Allows service providers to create, update, and manage the services they offer, including service descriptions, pricing, and availability.</w:t>
+        <w:t xml:space="preserve">  - Enables users to view, update, and manage their personal information and account details.</w:t>
       </w:r>
     </w:p>
     <w:p>
@@ -2993,7 +3376,7 @@
           <w:sz w:val="28"/>
           <w:szCs w:val="28"/>
         </w:rPr>
-        <w:t>• Service Search and Browsing</w:t>
+        <w:t>• Service Management</w:t>
       </w:r>
     </w:p>
     <w:p>
@@ -3013,7 +3396,8 @@
           <w:sz w:val="28"/>
           <w:szCs w:val="28"/>
         </w:rPr>
-        <w:t xml:space="preserve">  - Enables customers to browse available services and search for service providers based on categories and service types.</w:t>
+        <w:lastRenderedPageBreak/>
+        <w:t xml:space="preserve">  - Allows service providers to create, update, and manage the services they offer, including service descriptions, pricing, and availability.</w:t>
       </w:r>
     </w:p>
     <w:p>
@@ -3033,7 +3417,7 @@
           <w:sz w:val="28"/>
           <w:szCs w:val="28"/>
         </w:rPr>
-        <w:t>• Booking Management</w:t>
+        <w:t>• Service Search and Browsing</w:t>
       </w:r>
     </w:p>
     <w:p>
@@ -3053,8 +3437,7 @@
           <w:sz w:val="28"/>
           <w:szCs w:val="28"/>
         </w:rPr>
-        <w:lastRenderedPageBreak/>
-        <w:t xml:space="preserve">  - Allows customers to request service bookings, while service providers can accept, reject, or complete booking requests.</w:t>
+        <w:t xml:space="preserve">  - Enables customers to browse available services and search for service providers based on categories and service types.</w:t>
       </w:r>
     </w:p>
     <w:p>
@@ -3074,7 +3457,7 @@
           <w:sz w:val="28"/>
           <w:szCs w:val="28"/>
         </w:rPr>
-        <w:t>• Membership Management</w:t>
+        <w:t>• Booking Management</w:t>
       </w:r>
     </w:p>
     <w:p>
@@ -3094,7 +3477,7 @@
           <w:sz w:val="28"/>
           <w:szCs w:val="28"/>
         </w:rPr>
-        <w:t xml:space="preserve">  - Enables service providers to apply for membership plans and allows administrators to review and manage membership requests.</w:t>
+        <w:t xml:space="preserve">  - Allows customers to request service bookings, while service providers can accept, reject, or complete booking requests.</w:t>
       </w:r>
     </w:p>
     <w:p>
@@ -3114,7 +3497,7 @@
           <w:sz w:val="28"/>
           <w:szCs w:val="28"/>
         </w:rPr>
-        <w:t>• Review and Rating System</w:t>
+        <w:t>• Membership Management</w:t>
       </w:r>
     </w:p>
     <w:p>
@@ -3134,7 +3517,7 @@
           <w:sz w:val="28"/>
           <w:szCs w:val="28"/>
         </w:rPr>
-        <w:t xml:space="preserve">  - Allows customers to submit ratings and reviews for completed services to help maintain service quality.</w:t>
+        <w:t xml:space="preserve">  - Enables service providers to apply for membership plans and allows administrators to review and manage membership requests.</w:t>
       </w:r>
     </w:p>
     <w:p>
@@ -3154,7 +3537,7 @@
           <w:sz w:val="28"/>
           <w:szCs w:val="28"/>
         </w:rPr>
-        <w:t>• Administrative Management</w:t>
+        <w:t>• Review and Rating System</w:t>
       </w:r>
     </w:p>
     <w:p>
@@ -3174,7 +3557,7 @@
           <w:sz w:val="28"/>
           <w:szCs w:val="28"/>
         </w:rPr>
-        <w:t xml:space="preserve">  - Enables administrators to manage users, services, bookings, memberships, and monitor overall system activities.</w:t>
+        <w:t xml:space="preserve">  - Allows customers to submit ratings and reviews for completed services to help maintain service quality.</w:t>
       </w:r>
     </w:p>
     <w:p>
@@ -3194,7 +3577,7 @@
           <w:sz w:val="28"/>
           <w:szCs w:val="28"/>
         </w:rPr>
-        <w:t>• Secure Access Control</w:t>
+        <w:t>• Administrative Management</w:t>
       </w:r>
     </w:p>
     <w:p>
@@ -3214,7 +3597,7 @@
           <w:sz w:val="28"/>
           <w:szCs w:val="28"/>
         </w:rPr>
-        <w:t xml:space="preserve">  - Implements JWT-based authentication and role-based authorization to ensure secure access to system resources.</w:t>
+        <w:t xml:space="preserve">  - Enables administrators to manage users, services, bookings, memberships, and monitor overall system activities.</w:t>
       </w:r>
     </w:p>
     <w:p>
@@ -3228,6 +3611,14 @@
           <w:szCs w:val="28"/>
         </w:rPr>
       </w:pPr>
+      <w:r>
+        <w:rPr>
+          <w:rFonts w:ascii="Times New Roman" w:hAnsi="Times New Roman" w:cs="Times New Roman"/>
+          <w:sz w:val="28"/>
+          <w:szCs w:val="28"/>
+        </w:rPr>
+        <w:t>• Secure Access Control</w:t>
+      </w:r>
     </w:p>
     <w:p>
       <w:pPr>
@@ -3246,7 +3637,7 @@
           <w:sz w:val="28"/>
           <w:szCs w:val="28"/>
         </w:rPr>
-        <w:t>2.3 User Classes and Characteristics</w:t>
+        <w:t xml:space="preserve">  - Implements JWT-based authentication and role-based authorization to ensure secure access to system resources.</w:t>
       </w:r>
     </w:p>
     <w:p>
@@ -3260,14 +3651,6 @@
           <w:szCs w:val="28"/>
         </w:rPr>
       </w:pPr>
-      <w:r>
-        <w:rPr>
-          <w:rFonts w:ascii="Times New Roman" w:hAnsi="Times New Roman" w:cs="Times New Roman"/>
-          <w:sz w:val="28"/>
-          <w:szCs w:val="28"/>
-        </w:rPr>
-        <w:t>The Workly – Home Service Provider Platform consists of three primary user classes, each with different roles and responsibilities within the system.</w:t>
-      </w:r>
     </w:p>
     <w:p>
       <w:pPr>
@@ -3280,6 +3663,14 @@
           <w:szCs w:val="28"/>
         </w:rPr>
       </w:pPr>
+      <w:r>
+        <w:rPr>
+          <w:rFonts w:ascii="Times New Roman" w:hAnsi="Times New Roman" w:cs="Times New Roman"/>
+          <w:sz w:val="28"/>
+          <w:szCs w:val="28"/>
+        </w:rPr>
+        <w:t>2.3 User Classes and Characteristics</w:t>
+      </w:r>
     </w:p>
     <w:p>
       <w:pPr>
@@ -3292,6 +3683,14 @@
           <w:szCs w:val="28"/>
         </w:rPr>
       </w:pPr>
+      <w:r>
+        <w:rPr>
+          <w:rFonts w:ascii="Times New Roman" w:hAnsi="Times New Roman" w:cs="Times New Roman"/>
+          <w:sz w:val="28"/>
+          <w:szCs w:val="28"/>
+        </w:rPr>
+        <w:t>The Workly – Home Service Provider Platform consists of three primary user classes, each with different roles and responsibilities within the system.</w:t>
+      </w:r>
     </w:p>
     <w:p>
       <w:pPr>
@@ -3362,6 +3761,7 @@
           <w:sz w:val="28"/>
           <w:szCs w:val="28"/>
         </w:rPr>
+        <w:lastRenderedPageBreak/>
         <w:t>• Service Provider</w:t>
       </w:r>
     </w:p>
@@ -3402,7 +3802,6 @@
           <w:sz w:val="28"/>
           <w:szCs w:val="28"/>
         </w:rPr>
-        <w:lastRenderedPageBreak/>
         <w:t>• Administrator</w:t>
       </w:r>
     </w:p>
@@ -3725,14 +4124,6 @@
           <w:szCs w:val="28"/>
         </w:rPr>
       </w:pPr>
-      <w:r>
-        <w:rPr>
-          <w:rFonts w:ascii="Times New Roman" w:hAnsi="Times New Roman" w:cs="Times New Roman"/>
-          <w:sz w:val="28"/>
-          <w:szCs w:val="28"/>
-        </w:rPr>
-        <w:t>• Database</w:t>
-      </w:r>
     </w:p>
     <w:p>
       <w:pPr>
@@ -3751,7 +4142,8 @@
           <w:sz w:val="28"/>
           <w:szCs w:val="28"/>
         </w:rPr>
-        <w:t xml:space="preserve">  - MongoDB Atlas</w:t>
+        <w:lastRenderedPageBreak/>
+        <w:t>• Database</w:t>
       </w:r>
     </w:p>
     <w:p>
@@ -3765,6 +4157,14 @@
           <w:szCs w:val="28"/>
         </w:rPr>
       </w:pPr>
+      <w:r>
+        <w:rPr>
+          <w:rFonts w:ascii="Times New Roman" w:hAnsi="Times New Roman" w:cs="Times New Roman"/>
+          <w:sz w:val="28"/>
+          <w:szCs w:val="28"/>
+        </w:rPr>
+        <w:t xml:space="preserve">  - MongoDB Atlas</w:t>
+      </w:r>
     </w:p>
     <w:p>
       <w:pPr>
@@ -3777,14 +4177,6 @@
           <w:szCs w:val="28"/>
         </w:rPr>
       </w:pPr>
-      <w:r>
-        <w:rPr>
-          <w:rFonts w:ascii="Times New Roman" w:hAnsi="Times New Roman" w:cs="Times New Roman"/>
-          <w:sz w:val="28"/>
-          <w:szCs w:val="28"/>
-        </w:rPr>
-        <w:t>• Web Browser</w:t>
-      </w:r>
     </w:p>
     <w:p>
       <w:pPr>
@@ -3803,7 +4195,7 @@
           <w:sz w:val="28"/>
           <w:szCs w:val="28"/>
         </w:rPr>
-        <w:t xml:space="preserve">  - Google Chrome</w:t>
+        <w:t>• Web Browser</w:t>
       </w:r>
     </w:p>
     <w:p>
@@ -3823,8 +4215,7 @@
           <w:sz w:val="28"/>
           <w:szCs w:val="28"/>
         </w:rPr>
-        <w:lastRenderedPageBreak/>
-        <w:t xml:space="preserve">  - Mozilla Firefox</w:t>
+        <w:t xml:space="preserve">  - Google Chrome</w:t>
       </w:r>
     </w:p>
     <w:p>
@@ -3844,7 +4235,7 @@
           <w:sz w:val="28"/>
           <w:szCs w:val="28"/>
         </w:rPr>
-        <w:t xml:space="preserve">  - Microsoft Edge</w:t>
+        <w:t xml:space="preserve">  - Mozilla Firefox</w:t>
       </w:r>
     </w:p>
     <w:p>
@@ -3858,6 +4249,14 @@
           <w:szCs w:val="28"/>
         </w:rPr>
       </w:pPr>
+      <w:r>
+        <w:rPr>
+          <w:rFonts w:ascii="Times New Roman" w:hAnsi="Times New Roman" w:cs="Times New Roman"/>
+          <w:sz w:val="28"/>
+          <w:szCs w:val="28"/>
+        </w:rPr>
+        <w:t xml:space="preserve">  - Microsoft Edge</w:t>
+      </w:r>
     </w:p>
     <w:p>
       <w:pPr>
@@ -3870,14 +4269,6 @@
           <w:szCs w:val="28"/>
         </w:rPr>
       </w:pPr>
-      <w:r>
-        <w:rPr>
-          <w:rFonts w:ascii="Times New Roman" w:hAnsi="Times New Roman" w:cs="Times New Roman"/>
-          <w:sz w:val="28"/>
-          <w:szCs w:val="28"/>
-        </w:rPr>
-        <w:t>• Development Tools</w:t>
-      </w:r>
     </w:p>
     <w:p>
       <w:pPr>
@@ -3896,7 +4287,7 @@
           <w:sz w:val="28"/>
           <w:szCs w:val="28"/>
         </w:rPr>
-        <w:t xml:space="preserve">  - Visual Studio Code</w:t>
+        <w:t>• Development Tools</w:t>
       </w:r>
     </w:p>
     <w:p>
@@ -3916,7 +4307,7 @@
           <w:sz w:val="28"/>
           <w:szCs w:val="28"/>
         </w:rPr>
-        <w:t xml:space="preserve">  - IntelliJ IDEA</w:t>
+        <w:t xml:space="preserve">  - Visual Studio Code</w:t>
       </w:r>
     </w:p>
     <w:p>
@@ -3936,7 +4327,7 @@
           <w:sz w:val="28"/>
           <w:szCs w:val="28"/>
         </w:rPr>
-        <w:t xml:space="preserve">  - Git and GitHub</w:t>
+        <w:t xml:space="preserve">  - IntelliJ IDEA</w:t>
       </w:r>
     </w:p>
     <w:p>
@@ -3950,6 +4341,14 @@
           <w:szCs w:val="28"/>
         </w:rPr>
       </w:pPr>
+      <w:r>
+        <w:rPr>
+          <w:rFonts w:ascii="Times New Roman" w:hAnsi="Times New Roman" w:cs="Times New Roman"/>
+          <w:sz w:val="28"/>
+          <w:szCs w:val="28"/>
+        </w:rPr>
+        <w:t xml:space="preserve">  - Git and GitHub</w:t>
+      </w:r>
     </w:p>
     <w:p>
       <w:pPr>
@@ -3962,14 +4361,6 @@
           <w:szCs w:val="28"/>
         </w:rPr>
       </w:pPr>
-      <w:r>
-        <w:rPr>
-          <w:rFonts w:ascii="Times New Roman" w:hAnsi="Times New Roman" w:cs="Times New Roman"/>
-          <w:sz w:val="28"/>
-          <w:szCs w:val="28"/>
-        </w:rPr>
-        <w:t>2.5 Design Constraints</w:t>
-      </w:r>
     </w:p>
     <w:p>
       <w:pPr>
@@ -3982,6 +4373,14 @@
           <w:szCs w:val="28"/>
         </w:rPr>
       </w:pPr>
+      <w:r>
+        <w:rPr>
+          <w:rFonts w:ascii="Times New Roman" w:hAnsi="Times New Roman" w:cs="Times New Roman"/>
+          <w:sz w:val="28"/>
+          <w:szCs w:val="28"/>
+        </w:rPr>
+        <w:t>2.5 Design Constraints</w:t>
+      </w:r>
     </w:p>
     <w:p>
       <w:pPr>
@@ -4140,6 +4539,7 @@
           <w:sz w:val="28"/>
           <w:szCs w:val="28"/>
         </w:rPr>
+        <w:lastRenderedPageBreak/>
         <w:t>• The current version of the system does not include advanced features such as online payment processing, real-time messaging, GPS tracking, or a mobile application.</w:t>
       </w:r>
     </w:p>
@@ -4200,7 +4600,6 @@
           <w:sz w:val="28"/>
           <w:szCs w:val="28"/>
         </w:rPr>
-        <w:lastRenderedPageBreak/>
         <w:t>• Users have access to a stable internet connection and a modern web browser to use the system.</w:t>
       </w:r>
     </w:p>
@@ -4322,15 +4721,6 @@
         </w:rPr>
         <w:t>• Any interruption to the internet connection, server, or database may temporarily affect the availability of the system.</w:t>
       </w:r>
-    </w:p>
-    <w:p>
-      <w:pPr>
-        <w:rPr>
-          <w:rFonts w:ascii="Times New Roman" w:hAnsi="Times New Roman" w:cs="Times New Roman"/>
-          <w:sz w:val="28"/>
-          <w:szCs w:val="28"/>
-        </w:rPr>
-      </w:pPr>
     </w:p>
     <w:p>
       <w:pPr>
@@ -4457,6 +4847,7 @@
           <w:sz w:val="28"/>
           <w:szCs w:val="28"/>
         </w:rPr>
+        <w:lastRenderedPageBreak/>
         <w:t>FR-04: The system shall allow users to view and update their profile information.</w:t>
       </w:r>
     </w:p>
@@ -4508,288 +4899,288 @@
           <w:sz w:val="28"/>
           <w:szCs w:val="28"/>
         </w:rPr>
+        <w:t>FR-07: The system shall allow customers to view detailed information about service providers and the services they offer.</w:t>
+      </w:r>
+    </w:p>
+    <w:p>
+      <w:pPr>
+        <w:rPr>
+          <w:rFonts w:ascii="Times New Roman" w:hAnsi="Times New Roman" w:cs="Times New Roman"/>
+          <w:sz w:val="28"/>
+          <w:szCs w:val="28"/>
+        </w:rPr>
+      </w:pPr>
+      <w:r>
+        <w:rPr>
+          <w:rFonts w:ascii="Times New Roman" w:hAnsi="Times New Roman" w:cs="Times New Roman"/>
+          <w:sz w:val="28"/>
+          <w:szCs w:val="28"/>
+        </w:rPr>
+        <w:t>FR-08: The system shall allow customers to book services by selecting a provider and a preferred date and time.</w:t>
+      </w:r>
+    </w:p>
+    <w:p>
+      <w:pPr>
+        <w:rPr>
+          <w:rFonts w:ascii="Times New Roman" w:hAnsi="Times New Roman" w:cs="Times New Roman"/>
+          <w:sz w:val="28"/>
+          <w:szCs w:val="28"/>
+        </w:rPr>
+      </w:pPr>
+      <w:r>
+        <w:rPr>
+          <w:rFonts w:ascii="Times New Roman" w:hAnsi="Times New Roman" w:cs="Times New Roman"/>
+          <w:sz w:val="28"/>
+          <w:szCs w:val="28"/>
+        </w:rPr>
+        <w:t>FR-09: The system shall allow service providers to accept, reject, or complete booking requests.</w:t>
+      </w:r>
+    </w:p>
+    <w:p>
+      <w:pPr>
+        <w:rPr>
+          <w:rFonts w:ascii="Times New Roman" w:hAnsi="Times New Roman" w:cs="Times New Roman"/>
+          <w:sz w:val="28"/>
+          <w:szCs w:val="28"/>
+        </w:rPr>
+      </w:pPr>
+      <w:r>
+        <w:rPr>
+          <w:rFonts w:ascii="Times New Roman" w:hAnsi="Times New Roman" w:cs="Times New Roman"/>
+          <w:sz w:val="28"/>
+          <w:szCs w:val="28"/>
+        </w:rPr>
+        <w:t>FR-10: The system shall allow customers to view, cancel, and track the status of their bookings.</w:t>
+      </w:r>
+    </w:p>
+    <w:p>
+      <w:pPr>
+        <w:rPr>
+          <w:rFonts w:ascii="Times New Roman" w:hAnsi="Times New Roman" w:cs="Times New Roman"/>
+          <w:sz w:val="28"/>
+          <w:szCs w:val="28"/>
+        </w:rPr>
+      </w:pPr>
+      <w:r>
+        <w:rPr>
+          <w:rFonts w:ascii="Times New Roman" w:hAnsi="Times New Roman" w:cs="Times New Roman"/>
+          <w:sz w:val="28"/>
+          <w:szCs w:val="28"/>
+        </w:rPr>
+        <w:t>FR-11: The system shall allow service providers to manage their membership subscriptions.</w:t>
+      </w:r>
+    </w:p>
+    <w:p>
+      <w:pPr>
+        <w:rPr>
+          <w:rFonts w:ascii="Times New Roman" w:hAnsi="Times New Roman" w:cs="Times New Roman"/>
+          <w:sz w:val="28"/>
+          <w:szCs w:val="28"/>
+        </w:rPr>
+      </w:pPr>
+      <w:r>
+        <w:rPr>
+          <w:rFonts w:ascii="Times New Roman" w:hAnsi="Times New Roman" w:cs="Times New Roman"/>
+          <w:sz w:val="28"/>
+          <w:szCs w:val="28"/>
+        </w:rPr>
+        <w:t>FR-12: The system shall allow customers to submit ratings and reviews after a completed service.</w:t>
+      </w:r>
+    </w:p>
+    <w:p>
+      <w:pPr>
+        <w:rPr>
+          <w:rFonts w:ascii="Times New Roman" w:hAnsi="Times New Roman" w:cs="Times New Roman"/>
+          <w:sz w:val="28"/>
+          <w:szCs w:val="28"/>
+        </w:rPr>
+      </w:pPr>
+      <w:r>
+        <w:rPr>
+          <w:rFonts w:ascii="Times New Roman" w:hAnsi="Times New Roman" w:cs="Times New Roman"/>
+          <w:sz w:val="28"/>
+          <w:szCs w:val="28"/>
+        </w:rPr>
+        <w:t>FR-13: The system shall allow administrators to manage user accounts, including viewing, updating, and removing users when necessary.</w:t>
+      </w:r>
+    </w:p>
+    <w:p>
+      <w:pPr>
+        <w:rPr>
+          <w:rFonts w:ascii="Times New Roman" w:hAnsi="Times New Roman" w:cs="Times New Roman"/>
+          <w:sz w:val="28"/>
+          <w:szCs w:val="28"/>
+        </w:rPr>
+      </w:pPr>
+      <w:r>
+        <w:rPr>
+          <w:rFonts w:ascii="Times New Roman" w:hAnsi="Times New Roman" w:cs="Times New Roman"/>
+          <w:sz w:val="28"/>
+          <w:szCs w:val="28"/>
+        </w:rPr>
+        <w:t>FR-14: The system shall allow administrators to manage bookings and monitor platform activities.</w:t>
+      </w:r>
+    </w:p>
+    <w:p>
+      <w:pPr>
+        <w:rPr>
+          <w:rFonts w:ascii="Times New Roman" w:hAnsi="Times New Roman" w:cs="Times New Roman"/>
+          <w:sz w:val="28"/>
+          <w:szCs w:val="28"/>
+        </w:rPr>
+      </w:pPr>
+      <w:r>
+        <w:rPr>
+          <w:rFonts w:ascii="Times New Roman" w:hAnsi="Times New Roman" w:cs="Times New Roman"/>
+          <w:sz w:val="28"/>
+          <w:szCs w:val="28"/>
+        </w:rPr>
+        <w:t>FR-15: The system shall allow administrators to review and manage membership requests submitted by service providers.</w:t>
+      </w:r>
+    </w:p>
+    <w:p>
+      <w:pPr>
+        <w:rPr>
+          <w:rFonts w:ascii="Times New Roman" w:hAnsi="Times New Roman" w:cs="Times New Roman"/>
+          <w:sz w:val="28"/>
+          <w:szCs w:val="28"/>
+        </w:rPr>
+      </w:pPr>
+      <w:r>
+        <w:rPr>
+          <w:rFonts w:ascii="Times New Roman" w:hAnsi="Times New Roman" w:cs="Times New Roman"/>
+          <w:sz w:val="28"/>
+          <w:szCs w:val="28"/>
+        </w:rPr>
+        <w:t>FR-16: The system shall store and retrieve all application data securely using MongoDB.</w:t>
+      </w:r>
+    </w:p>
+    <w:p>
+      <w:pPr>
+        <w:rPr>
+          <w:rFonts w:ascii="Times New Roman" w:hAnsi="Times New Roman" w:cs="Times New Roman"/>
+          <w:sz w:val="28"/>
+          <w:szCs w:val="28"/>
+        </w:rPr>
+      </w:pPr>
+      <w:r>
+        <w:rPr>
+          <w:rFonts w:ascii="Times New Roman" w:hAnsi="Times New Roman" w:cs="Times New Roman"/>
+          <w:sz w:val="28"/>
+          <w:szCs w:val="28"/>
+        </w:rPr>
+        <w:t>FR-17: The system shall provide appropriate success and error messages for user actions.</w:t>
+      </w:r>
+    </w:p>
+    <w:p>
+      <w:pPr>
+        <w:rPr>
+          <w:rFonts w:ascii="Times New Roman" w:hAnsi="Times New Roman" w:cs="Times New Roman"/>
+          <w:sz w:val="28"/>
+          <w:szCs w:val="28"/>
+        </w:rPr>
+      </w:pPr>
+    </w:p>
+    <w:p>
+      <w:pPr>
+        <w:rPr>
+          <w:rFonts w:ascii="Times New Roman" w:hAnsi="Times New Roman" w:cs="Times New Roman"/>
+          <w:sz w:val="28"/>
+          <w:szCs w:val="28"/>
+        </w:rPr>
+      </w:pPr>
+      <w:r>
+        <w:rPr>
+          <w:rFonts w:ascii="Times New Roman" w:hAnsi="Times New Roman" w:cs="Times New Roman"/>
+          <w:sz w:val="28"/>
+          <w:szCs w:val="28"/>
+        </w:rPr>
+        <w:t>3.2 Non-Functional Requirements</w:t>
+      </w:r>
+    </w:p>
+    <w:p>
+      <w:pPr>
+        <w:rPr>
+          <w:rFonts w:ascii="Times New Roman" w:hAnsi="Times New Roman" w:cs="Times New Roman"/>
+          <w:sz w:val="28"/>
+          <w:szCs w:val="28"/>
+        </w:rPr>
+      </w:pPr>
+      <w:r>
+        <w:rPr>
+          <w:rFonts w:ascii="Times New Roman" w:hAnsi="Times New Roman" w:cs="Times New Roman"/>
+          <w:sz w:val="28"/>
+          <w:szCs w:val="28"/>
+        </w:rPr>
+        <w:t>The Workly – Home Service Provider Platform shall satisfy the following non-functional requirements:</w:t>
+      </w:r>
+    </w:p>
+    <w:p>
+      <w:pPr>
+        <w:rPr>
+          <w:rFonts w:ascii="Times New Roman" w:hAnsi="Times New Roman" w:cs="Times New Roman"/>
+          <w:sz w:val="28"/>
+          <w:szCs w:val="28"/>
+        </w:rPr>
+      </w:pPr>
+      <w:r>
+        <w:rPr>
+          <w:rFonts w:ascii="Times New Roman" w:hAnsi="Times New Roman" w:cs="Times New Roman"/>
+          <w:sz w:val="28"/>
+          <w:szCs w:val="28"/>
+        </w:rPr>
+        <w:t>NFR-01: Performance</w:t>
+      </w:r>
+    </w:p>
+    <w:p>
+      <w:pPr>
+        <w:rPr>
+          <w:rFonts w:ascii="Times New Roman" w:hAnsi="Times New Roman" w:cs="Times New Roman"/>
+          <w:sz w:val="28"/>
+          <w:szCs w:val="28"/>
+        </w:rPr>
+      </w:pPr>
+      <w:r>
+        <w:rPr>
+          <w:rFonts w:ascii="Times New Roman" w:hAnsi="Times New Roman" w:cs="Times New Roman"/>
+          <w:sz w:val="28"/>
+          <w:szCs w:val="28"/>
+        </w:rPr>
+        <w:t>The system shall respond to user requests within a reasonable time under normal operating conditions.</w:t>
+      </w:r>
+    </w:p>
+    <w:p>
+      <w:pPr>
+        <w:rPr>
+          <w:rFonts w:ascii="Times New Roman" w:hAnsi="Times New Roman" w:cs="Times New Roman"/>
+          <w:sz w:val="28"/>
+          <w:szCs w:val="28"/>
+        </w:rPr>
+      </w:pPr>
+      <w:r>
+        <w:rPr>
+          <w:rFonts w:ascii="Times New Roman" w:hAnsi="Times New Roman" w:cs="Times New Roman"/>
+          <w:sz w:val="28"/>
+          <w:szCs w:val="28"/>
+        </w:rPr>
+        <w:t>NFR-02: Security</w:t>
+      </w:r>
+    </w:p>
+    <w:p>
+      <w:pPr>
+        <w:rPr>
+          <w:rFonts w:ascii="Times New Roman" w:hAnsi="Times New Roman" w:cs="Times New Roman"/>
+          <w:sz w:val="28"/>
+          <w:szCs w:val="28"/>
+        </w:rPr>
+      </w:pPr>
+      <w:r>
+        <w:rPr>
+          <w:rFonts w:ascii="Times New Roman" w:hAnsi="Times New Roman" w:cs="Times New Roman"/>
+          <w:sz w:val="28"/>
+          <w:szCs w:val="28"/>
+        </w:rPr>
         <w:lastRenderedPageBreak/>
-        <w:t>FR-07: The system shall allow customers to view detailed information about service providers and the services they offer.</w:t>
-      </w:r>
-    </w:p>
-    <w:p>
-      <w:pPr>
-        <w:rPr>
-          <w:rFonts w:ascii="Times New Roman" w:hAnsi="Times New Roman" w:cs="Times New Roman"/>
-          <w:sz w:val="28"/>
-          <w:szCs w:val="28"/>
-        </w:rPr>
-      </w:pPr>
-      <w:r>
-        <w:rPr>
-          <w:rFonts w:ascii="Times New Roman" w:hAnsi="Times New Roman" w:cs="Times New Roman"/>
-          <w:sz w:val="28"/>
-          <w:szCs w:val="28"/>
-        </w:rPr>
-        <w:t>FR-08: The system shall allow customers to book services by selecting a provider and a preferred date and time.</w:t>
-      </w:r>
-    </w:p>
-    <w:p>
-      <w:pPr>
-        <w:rPr>
-          <w:rFonts w:ascii="Times New Roman" w:hAnsi="Times New Roman" w:cs="Times New Roman"/>
-          <w:sz w:val="28"/>
-          <w:szCs w:val="28"/>
-        </w:rPr>
-      </w:pPr>
-      <w:r>
-        <w:rPr>
-          <w:rFonts w:ascii="Times New Roman" w:hAnsi="Times New Roman" w:cs="Times New Roman"/>
-          <w:sz w:val="28"/>
-          <w:szCs w:val="28"/>
-        </w:rPr>
-        <w:t>FR-09: The system shall allow service providers to accept, reject, or complete booking requests.</w:t>
-      </w:r>
-    </w:p>
-    <w:p>
-      <w:pPr>
-        <w:rPr>
-          <w:rFonts w:ascii="Times New Roman" w:hAnsi="Times New Roman" w:cs="Times New Roman"/>
-          <w:sz w:val="28"/>
-          <w:szCs w:val="28"/>
-        </w:rPr>
-      </w:pPr>
-      <w:r>
-        <w:rPr>
-          <w:rFonts w:ascii="Times New Roman" w:hAnsi="Times New Roman" w:cs="Times New Roman"/>
-          <w:sz w:val="28"/>
-          <w:szCs w:val="28"/>
-        </w:rPr>
-        <w:t>FR-10: The system shall allow customers to view, cancel, and track the status of their bookings.</w:t>
-      </w:r>
-    </w:p>
-    <w:p>
-      <w:pPr>
-        <w:rPr>
-          <w:rFonts w:ascii="Times New Roman" w:hAnsi="Times New Roman" w:cs="Times New Roman"/>
-          <w:sz w:val="28"/>
-          <w:szCs w:val="28"/>
-        </w:rPr>
-      </w:pPr>
-      <w:r>
-        <w:rPr>
-          <w:rFonts w:ascii="Times New Roman" w:hAnsi="Times New Roman" w:cs="Times New Roman"/>
-          <w:sz w:val="28"/>
-          <w:szCs w:val="28"/>
-        </w:rPr>
-        <w:t>FR-11: The system shall allow service providers to manage their membership subscriptions.</w:t>
-      </w:r>
-    </w:p>
-    <w:p>
-      <w:pPr>
-        <w:rPr>
-          <w:rFonts w:ascii="Times New Roman" w:hAnsi="Times New Roman" w:cs="Times New Roman"/>
-          <w:sz w:val="28"/>
-          <w:szCs w:val="28"/>
-        </w:rPr>
-      </w:pPr>
-      <w:r>
-        <w:rPr>
-          <w:rFonts w:ascii="Times New Roman" w:hAnsi="Times New Roman" w:cs="Times New Roman"/>
-          <w:sz w:val="28"/>
-          <w:szCs w:val="28"/>
-        </w:rPr>
-        <w:t>FR-12: The system shall allow customers to submit ratings and reviews after a completed service.</w:t>
-      </w:r>
-    </w:p>
-    <w:p>
-      <w:pPr>
-        <w:rPr>
-          <w:rFonts w:ascii="Times New Roman" w:hAnsi="Times New Roman" w:cs="Times New Roman"/>
-          <w:sz w:val="28"/>
-          <w:szCs w:val="28"/>
-        </w:rPr>
-      </w:pPr>
-      <w:r>
-        <w:rPr>
-          <w:rFonts w:ascii="Times New Roman" w:hAnsi="Times New Roman" w:cs="Times New Roman"/>
-          <w:sz w:val="28"/>
-          <w:szCs w:val="28"/>
-        </w:rPr>
-        <w:t>FR-13: The system shall allow administrators to manage user accounts, including viewing, updating, and removing users when necessary.</w:t>
-      </w:r>
-    </w:p>
-    <w:p>
-      <w:pPr>
-        <w:rPr>
-          <w:rFonts w:ascii="Times New Roman" w:hAnsi="Times New Roman" w:cs="Times New Roman"/>
-          <w:sz w:val="28"/>
-          <w:szCs w:val="28"/>
-        </w:rPr>
-      </w:pPr>
-      <w:r>
-        <w:rPr>
-          <w:rFonts w:ascii="Times New Roman" w:hAnsi="Times New Roman" w:cs="Times New Roman"/>
-          <w:sz w:val="28"/>
-          <w:szCs w:val="28"/>
-        </w:rPr>
-        <w:t>FR-14: The system shall allow administrators to manage bookings and monitor platform activities.</w:t>
-      </w:r>
-    </w:p>
-    <w:p>
-      <w:pPr>
-        <w:rPr>
-          <w:rFonts w:ascii="Times New Roman" w:hAnsi="Times New Roman" w:cs="Times New Roman"/>
-          <w:sz w:val="28"/>
-          <w:szCs w:val="28"/>
-        </w:rPr>
-      </w:pPr>
-      <w:r>
-        <w:rPr>
-          <w:rFonts w:ascii="Times New Roman" w:hAnsi="Times New Roman" w:cs="Times New Roman"/>
-          <w:sz w:val="28"/>
-          <w:szCs w:val="28"/>
-        </w:rPr>
-        <w:t>FR-15: The system shall allow administrators to review and manage membership requests submitted by service providers.</w:t>
-      </w:r>
-    </w:p>
-    <w:p>
-      <w:pPr>
-        <w:rPr>
-          <w:rFonts w:ascii="Times New Roman" w:hAnsi="Times New Roman" w:cs="Times New Roman"/>
-          <w:sz w:val="28"/>
-          <w:szCs w:val="28"/>
-        </w:rPr>
-      </w:pPr>
-      <w:r>
-        <w:rPr>
-          <w:rFonts w:ascii="Times New Roman" w:hAnsi="Times New Roman" w:cs="Times New Roman"/>
-          <w:sz w:val="28"/>
-          <w:szCs w:val="28"/>
-        </w:rPr>
-        <w:t>FR-16: The system shall store and retrieve all application data securely using MongoDB.</w:t>
-      </w:r>
-    </w:p>
-    <w:p>
-      <w:pPr>
-        <w:rPr>
-          <w:rFonts w:ascii="Times New Roman" w:hAnsi="Times New Roman" w:cs="Times New Roman"/>
-          <w:sz w:val="28"/>
-          <w:szCs w:val="28"/>
-        </w:rPr>
-      </w:pPr>
-      <w:r>
-        <w:rPr>
-          <w:rFonts w:ascii="Times New Roman" w:hAnsi="Times New Roman" w:cs="Times New Roman"/>
-          <w:sz w:val="28"/>
-          <w:szCs w:val="28"/>
-        </w:rPr>
-        <w:t>FR-17: The system shall provide appropriate success and error messages for user actions.</w:t>
-      </w:r>
-    </w:p>
-    <w:p>
-      <w:pPr>
-        <w:rPr>
-          <w:rFonts w:ascii="Times New Roman" w:hAnsi="Times New Roman" w:cs="Times New Roman"/>
-          <w:sz w:val="28"/>
-          <w:szCs w:val="28"/>
-        </w:rPr>
-      </w:pPr>
-    </w:p>
-    <w:p>
-      <w:pPr>
-        <w:rPr>
-          <w:rFonts w:ascii="Times New Roman" w:hAnsi="Times New Roman" w:cs="Times New Roman"/>
-          <w:sz w:val="28"/>
-          <w:szCs w:val="28"/>
-        </w:rPr>
-      </w:pPr>
-      <w:r>
-        <w:rPr>
-          <w:rFonts w:ascii="Times New Roman" w:hAnsi="Times New Roman" w:cs="Times New Roman"/>
-          <w:sz w:val="28"/>
-          <w:szCs w:val="28"/>
-        </w:rPr>
-        <w:t>3.2 Non-Functional Requirements</w:t>
-      </w:r>
-    </w:p>
-    <w:p>
-      <w:pPr>
-        <w:rPr>
-          <w:rFonts w:ascii="Times New Roman" w:hAnsi="Times New Roman" w:cs="Times New Roman"/>
-          <w:sz w:val="28"/>
-          <w:szCs w:val="28"/>
-        </w:rPr>
-      </w:pPr>
-      <w:r>
-        <w:rPr>
-          <w:rFonts w:ascii="Times New Roman" w:hAnsi="Times New Roman" w:cs="Times New Roman"/>
-          <w:sz w:val="28"/>
-          <w:szCs w:val="28"/>
-        </w:rPr>
-        <w:t>The Workly – Home Service Provider Platform shall satisfy the following non-functional requirements:</w:t>
-      </w:r>
-    </w:p>
-    <w:p>
-      <w:pPr>
-        <w:rPr>
-          <w:rFonts w:ascii="Times New Roman" w:hAnsi="Times New Roman" w:cs="Times New Roman"/>
-          <w:sz w:val="28"/>
-          <w:szCs w:val="28"/>
-        </w:rPr>
-      </w:pPr>
-      <w:r>
-        <w:rPr>
-          <w:rFonts w:ascii="Times New Roman" w:hAnsi="Times New Roman" w:cs="Times New Roman"/>
-          <w:sz w:val="28"/>
-          <w:szCs w:val="28"/>
-        </w:rPr>
-        <w:t>NFR-01: Performance</w:t>
-      </w:r>
-    </w:p>
-    <w:p>
-      <w:pPr>
-        <w:rPr>
-          <w:rFonts w:ascii="Times New Roman" w:hAnsi="Times New Roman" w:cs="Times New Roman"/>
-          <w:sz w:val="28"/>
-          <w:szCs w:val="28"/>
-        </w:rPr>
-      </w:pPr>
-      <w:r>
-        <w:rPr>
-          <w:rFonts w:ascii="Times New Roman" w:hAnsi="Times New Roman" w:cs="Times New Roman"/>
-          <w:sz w:val="28"/>
-          <w:szCs w:val="28"/>
-        </w:rPr>
-        <w:t>The system shall respond to user requests within a reasonable time under normal operating conditions.</w:t>
-      </w:r>
-    </w:p>
-    <w:p>
-      <w:pPr>
-        <w:rPr>
-          <w:rFonts w:ascii="Times New Roman" w:hAnsi="Times New Roman" w:cs="Times New Roman"/>
-          <w:sz w:val="28"/>
-          <w:szCs w:val="28"/>
-        </w:rPr>
-      </w:pPr>
-      <w:r>
-        <w:rPr>
-          <w:rFonts w:ascii="Times New Roman" w:hAnsi="Times New Roman" w:cs="Times New Roman"/>
-          <w:sz w:val="28"/>
-          <w:szCs w:val="28"/>
-        </w:rPr>
-        <w:t>NFR-02: Security</w:t>
-      </w:r>
-    </w:p>
-    <w:p>
-      <w:pPr>
-        <w:rPr>
-          <w:rFonts w:ascii="Times New Roman" w:hAnsi="Times New Roman" w:cs="Times New Roman"/>
-          <w:sz w:val="28"/>
-          <w:szCs w:val="28"/>
-        </w:rPr>
-      </w:pPr>
-      <w:r>
-        <w:rPr>
-          <w:rFonts w:ascii="Times New Roman" w:hAnsi="Times New Roman" w:cs="Times New Roman"/>
-          <w:sz w:val="28"/>
-          <w:szCs w:val="28"/>
-        </w:rPr>
         <w:t>The system shall provide secure user authentication using JSON Web Tokens (JWT) and protect user data from unauthorized access.</w:t>
       </w:r>
     </w:p>
@@ -4841,7 +5232,6 @@
           <w:sz w:val="28"/>
           <w:szCs w:val="28"/>
         </w:rPr>
-        <w:lastRenderedPageBreak/>
         <w:t>NFR-04: Availability</w:t>
       </w:r>
     </w:p>
@@ -4972,15 +5362,6 @@
           <w:szCs w:val="28"/>
         </w:rPr>
       </w:pPr>
-    </w:p>
-    <w:p>
-      <w:pPr>
-        <w:rPr>
-          <w:rFonts w:ascii="Times New Roman" w:hAnsi="Times New Roman" w:cs="Times New Roman"/>
-          <w:sz w:val="28"/>
-          <w:szCs w:val="28"/>
-        </w:rPr>
-      </w:pPr>
       <w:r>
         <w:rPr>
           <w:rFonts w:ascii="Times New Roman" w:hAnsi="Times New Roman" w:cs="Times New Roman"/>
@@ -5078,6 +5459,34 @@
     <w:p>
       <w:pPr>
         <w:rPr>
+          <w:rFonts w:ascii="Times New Roman" w:hAnsi="Times New Roman" w:cs="Times New Roman"/>
+          <w:sz w:val="28"/>
+          <w:szCs w:val="28"/>
+        </w:rPr>
+      </w:pPr>
+    </w:p>
+    <w:p>
+      <w:pPr>
+        <w:rPr>
+          <w:rFonts w:ascii="Times New Roman" w:hAnsi="Times New Roman" w:cs="Times New Roman"/>
+          <w:sz w:val="28"/>
+          <w:szCs w:val="28"/>
+        </w:rPr>
+      </w:pPr>
+    </w:p>
+    <w:p>
+      <w:pPr>
+        <w:rPr>
+          <w:rFonts w:ascii="Times New Roman" w:hAnsi="Times New Roman" w:cs="Times New Roman"/>
+          <w:sz w:val="28"/>
+          <w:szCs w:val="28"/>
+        </w:rPr>
+      </w:pPr>
+    </w:p>
+    <w:p>
+      <w:pPr>
+        <w:rPr>
+          <w:rFonts w:ascii="Times New Roman" w:hAnsi="Times New Roman" w:cs="Times New Roman"/>
           <w:sz w:val="28"/>
           <w:szCs w:val="28"/>
         </w:rPr>
@@ -5103,6 +5512,7 @@
           <w:szCs w:val="32"/>
           <w14:ligatures w14:val="none"/>
         </w:rPr>
+        <w:lastRenderedPageBreak/>
         <w:t>4</w:t>
       </w:r>
       <w:r>
@@ -5194,7 +5604,6 @@
           <w:szCs w:val="28"/>
           <w14:ligatures w14:val="none"/>
         </w:rPr>
-        <w:lastRenderedPageBreak/>
         <w:t>The Customer actor represents registered users who search for services, view service provider profiles, book appointments, track the status of their bookings, and submit ratings and reviews after a service is completed.</w:t>
       </w:r>
     </w:p>
@@ -5242,75 +5651,6 @@
           <w14:ligatures w14:val="none"/>
         </w:rPr>
         <w:t>The Administrator actor represents the system's platform managers, responsible for managing user accounts, monitoring and overseeing bookings, reviewing service provider membership requests, and ensuring the overall smooth operation of the system.</w:t>
-      </w:r>
-    </w:p>
-    <w:p>
-      <w:pPr>
-        <w:rPr>
-          <w:rFonts w:ascii="Times New Roman" w:eastAsiaTheme="majorEastAsia" w:hAnsi="Times New Roman" w:cs="Times New Roman"/>
-          <w:color w:val="000000" w:themeColor="text1"/>
-          <w:kern w:val="0"/>
-          <w:sz w:val="28"/>
-          <w:szCs w:val="28"/>
-          <w14:ligatures w14:val="none"/>
-        </w:rPr>
-      </w:pPr>
-      <w:r>
-        <w:rPr>
-          <w:rFonts w:ascii="Times New Roman" w:eastAsiaTheme="majorEastAsia" w:hAnsi="Times New Roman" w:cs="Times New Roman"/>
-          <w:color w:val="000000" w:themeColor="text1"/>
-          <w:kern w:val="0"/>
-          <w:sz w:val="28"/>
-          <w:szCs w:val="28"/>
-          <w14:ligatures w14:val="none"/>
-        </w:rPr>
-        <w:t>Three use cases — Register Account, Login, and Manage Profile — are shared across all three actors, since authentication and profile management are common to every user role. The diagram also models two standard UML relationships to capture dependencies between use cases:</w:t>
-      </w:r>
-    </w:p>
-    <w:p>
-      <w:pPr>
-        <w:rPr>
-          <w:rFonts w:ascii="Times New Roman" w:eastAsiaTheme="majorEastAsia" w:hAnsi="Times New Roman" w:cs="Times New Roman"/>
-          <w:color w:val="000000" w:themeColor="text1"/>
-          <w:kern w:val="0"/>
-          <w:sz w:val="28"/>
-          <w:szCs w:val="28"/>
-          <w14:ligatures w14:val="none"/>
-        </w:rPr>
-      </w:pPr>
-      <w:r>
-        <w:rPr>
-          <w:rFonts w:ascii="Times New Roman" w:eastAsiaTheme="majorEastAsia" w:hAnsi="Times New Roman" w:cs="Times New Roman"/>
-          <w:color w:val="000000" w:themeColor="text1"/>
-          <w:kern w:val="0"/>
-          <w:sz w:val="28"/>
-          <w:szCs w:val="28"/>
-          <w14:ligatures w14:val="none"/>
-        </w:rPr>
-        <w:t>Book Service includes Login, since a customer must be authenticated before a booking can be made.</w:t>
-      </w:r>
-    </w:p>
-    <w:p>
-      <w:pPr>
-        <w:rPr>
-          <w:rFonts w:ascii="Times New Roman" w:eastAsiaTheme="majorEastAsia" w:hAnsi="Times New Roman" w:cs="Times New Roman"/>
-          <w:color w:val="000000" w:themeColor="text1"/>
-          <w:kern w:val="0"/>
-          <w:sz w:val="28"/>
-          <w:szCs w:val="28"/>
-          <w14:ligatures w14:val="none"/>
-        </w:rPr>
-      </w:pPr>
-      <w:r>
-        <w:rPr>
-          <w:rFonts w:ascii="Times New Roman" w:eastAsiaTheme="majorEastAsia" w:hAnsi="Times New Roman" w:cs="Times New Roman"/>
-          <w:color w:val="000000" w:themeColor="text1"/>
-          <w:kern w:val="0"/>
-          <w:sz w:val="28"/>
-          <w:szCs w:val="28"/>
-          <w14:ligatures w14:val="none"/>
-        </w:rPr>
-        <w:t>Submit Rating &amp; Review extends Complete Booking, since a review can only be submitted once a booking has been marked as completed by the service provider.</w:t>
       </w:r>
     </w:p>
     <w:p>
@@ -5335,17 +5675,17 @@
           <w14:ligatures w14:val="none"/>
         </w:rPr>
         <w:drawing>
-          <wp:anchor distT="0" distB="0" distL="114300" distR="114300" simplePos="0" relativeHeight="251660288" behindDoc="0" locked="0" layoutInCell="1" allowOverlap="1" wp14:anchorId="5637A6CF" wp14:editId="2C3D2BAA">
+          <wp:anchor distT="0" distB="0" distL="114300" distR="114300" simplePos="0" relativeHeight="251659264" behindDoc="0" locked="0" layoutInCell="1" allowOverlap="1" wp14:anchorId="5637A6CF" wp14:editId="42FD6BEE">
             <wp:simplePos x="0" y="0"/>
-            <wp:positionH relativeFrom="margin">
-              <wp:align>center</wp:align>
+            <wp:positionH relativeFrom="column">
+              <wp:posOffset>1645920</wp:posOffset>
             </wp:positionH>
             <wp:positionV relativeFrom="paragraph">
-              <wp:posOffset>512445</wp:posOffset>
+              <wp:posOffset>865505</wp:posOffset>
             </wp:positionV>
-            <wp:extent cx="6240021" cy="4213860"/>
-            <wp:effectExtent l="0" t="0" r="8890" b="0"/>
-            <wp:wrapNone/>
+            <wp:extent cx="5576570" cy="4213225"/>
+            <wp:effectExtent l="0" t="0" r="5080" b="0"/>
+            <wp:wrapSquare wrapText="bothSides"/>
             <wp:docPr id="400531110" name="Picture 4"/>
             <wp:cNvGraphicFramePr>
               <a:graphicFrameLocks xmlns:a="http://schemas.openxmlformats.org/drawingml/2006/main" noChangeAspect="1"/>
@@ -5360,7 +5700,7 @@
                     </pic:cNvPicPr>
                   </pic:nvPicPr>
                   <pic:blipFill>
-                    <a:blip r:embed="rId8">
+                    <a:blip r:embed="rId9">
                       <a:extLst>
                         <a:ext uri="{28A0092B-C50C-407E-A947-70E740481C1C}">
                           <a14:useLocalDpi xmlns:a14="http://schemas.microsoft.com/office/drawing/2010/main" val="0"/>
@@ -5375,7 +5715,7 @@
                   <pic:spPr bwMode="auto">
                     <a:xfrm>
                       <a:off x="0" y="0"/>
-                      <a:ext cx="6242313" cy="4215408"/>
+                      <a:ext cx="5576570" cy="4213225"/>
                     </a:xfrm>
                     <a:prstGeom prst="rect">
                       <a:avLst/>
@@ -5388,12 +5728,6 @@
                 </pic:pic>
               </a:graphicData>
             </a:graphic>
-            <wp14:sizeRelH relativeFrom="margin">
-              <wp14:pctWidth>0</wp14:pctWidth>
-            </wp14:sizeRelH>
-            <wp14:sizeRelV relativeFrom="margin">
-              <wp14:pctHeight>0</wp14:pctHeight>
-            </wp14:sizeRelV>
           </wp:anchor>
         </w:drawing>
       </w:r>
@@ -5406,6 +5740,87 @@
           <w:szCs w:val="28"/>
           <w14:ligatures w14:val="none"/>
         </w:rPr>
+        <w:t>Three use cases — Register Account, Login, and Manage Profile — are shared across all three actors, since authentication and profile management are common to every user role. The diagram also models two standard UML relationships to capture dependencies between use cases:</w:t>
+      </w:r>
+    </w:p>
+    <w:p>
+      <w:pPr>
+        <w:rPr>
+          <w:rFonts w:ascii="Times New Roman" w:eastAsiaTheme="majorEastAsia" w:hAnsi="Times New Roman" w:cs="Times New Roman"/>
+          <w:color w:val="000000" w:themeColor="text1"/>
+          <w:kern w:val="0"/>
+          <w:sz w:val="28"/>
+          <w:szCs w:val="28"/>
+          <w14:ligatures w14:val="none"/>
+        </w:rPr>
+      </w:pPr>
+      <w:r>
+        <w:rPr>
+          <w:rFonts w:ascii="Times New Roman" w:eastAsiaTheme="majorEastAsia" w:hAnsi="Times New Roman" w:cs="Times New Roman"/>
+          <w:color w:val="000000" w:themeColor="text1"/>
+          <w:kern w:val="0"/>
+          <w:sz w:val="28"/>
+          <w:szCs w:val="28"/>
+          <w14:ligatures w14:val="none"/>
+        </w:rPr>
+        <w:t>Book Service includes Login, since a customer must be authenticated before a booking can be made.</w:t>
+      </w:r>
+    </w:p>
+    <w:p>
+      <w:pPr>
+        <w:rPr>
+          <w:rFonts w:ascii="Times New Roman" w:eastAsiaTheme="majorEastAsia" w:hAnsi="Times New Roman" w:cs="Times New Roman"/>
+          <w:color w:val="000000" w:themeColor="text1"/>
+          <w:kern w:val="0"/>
+          <w:sz w:val="28"/>
+          <w:szCs w:val="28"/>
+          <w14:ligatures w14:val="none"/>
+        </w:rPr>
+      </w:pPr>
+      <w:r>
+        <w:rPr>
+          <w:rFonts w:ascii="Times New Roman" w:eastAsiaTheme="majorEastAsia" w:hAnsi="Times New Roman" w:cs="Times New Roman"/>
+          <w:color w:val="000000" w:themeColor="text1"/>
+          <w:kern w:val="0"/>
+          <w:sz w:val="28"/>
+          <w:szCs w:val="28"/>
+          <w14:ligatures w14:val="none"/>
+        </w:rPr>
+        <w:t xml:space="preserve">Submit Rating &amp; Review extends Complete Booking, since a review can only be submitted </w:t>
+      </w:r>
+      <w:r>
+        <w:rPr>
+          <w:rFonts w:ascii="Times New Roman" w:eastAsiaTheme="majorEastAsia" w:hAnsi="Times New Roman" w:cs="Times New Roman"/>
+          <w:color w:val="000000" w:themeColor="text1"/>
+          <w:kern w:val="0"/>
+          <w:sz w:val="28"/>
+          <w:szCs w:val="28"/>
+          <w14:ligatures w14:val="none"/>
+        </w:rPr>
+        <w:lastRenderedPageBreak/>
+        <w:t>once a booking has been marked as completed by the service provider.</w:t>
+      </w:r>
+    </w:p>
+    <w:p>
+      <w:pPr>
+        <w:rPr>
+          <w:rFonts w:ascii="Times New Roman" w:eastAsiaTheme="majorEastAsia" w:hAnsi="Times New Roman" w:cs="Times New Roman"/>
+          <w:color w:val="000000" w:themeColor="text1"/>
+          <w:kern w:val="0"/>
+          <w:sz w:val="28"/>
+          <w:szCs w:val="28"/>
+          <w14:ligatures w14:val="none"/>
+        </w:rPr>
+      </w:pPr>
+      <w:r>
+        <w:rPr>
+          <w:rFonts w:ascii="Times New Roman" w:eastAsiaTheme="majorEastAsia" w:hAnsi="Times New Roman" w:cs="Times New Roman"/>
+          <w:color w:val="000000" w:themeColor="text1"/>
+          <w:kern w:val="0"/>
+          <w:sz w:val="28"/>
+          <w:szCs w:val="28"/>
+          <w14:ligatures w14:val="none"/>
+        </w:rPr>
         <w:t>Together, these use cases and relationships summarize the complete set of interactions supported by the Workly platform across all user roles.</w:t>
       </w:r>
     </w:p>
@@ -5432,148 +5847,15 @@
           <w14:ligatures w14:val="none"/>
         </w:rPr>
       </w:pPr>
-    </w:p>
-    <w:p>
-      <w:pPr>
-        <w:rPr>
-          <w:rFonts w:ascii="Times New Roman" w:eastAsiaTheme="majorEastAsia" w:hAnsi="Times New Roman" w:cs="Times New Roman"/>
-          <w:color w:val="000000" w:themeColor="text1"/>
-          <w:kern w:val="0"/>
-          <w:sz w:val="28"/>
-          <w:szCs w:val="28"/>
-          <w14:ligatures w14:val="none"/>
-        </w:rPr>
-      </w:pPr>
-    </w:p>
-    <w:p>
-      <w:pPr>
-        <w:rPr>
-          <w:rFonts w:ascii="Times New Roman" w:eastAsiaTheme="majorEastAsia" w:hAnsi="Times New Roman" w:cs="Times New Roman"/>
-          <w:color w:val="000000" w:themeColor="text1"/>
-          <w:kern w:val="0"/>
-          <w:sz w:val="28"/>
-          <w:szCs w:val="28"/>
-          <w14:ligatures w14:val="none"/>
-        </w:rPr>
-      </w:pPr>
-    </w:p>
-    <w:p>
-      <w:pPr>
-        <w:rPr>
-          <w:rFonts w:ascii="Times New Roman" w:eastAsiaTheme="majorEastAsia" w:hAnsi="Times New Roman" w:cs="Times New Roman"/>
-          <w:color w:val="000000" w:themeColor="text1"/>
-          <w:kern w:val="0"/>
-          <w:sz w:val="28"/>
-          <w:szCs w:val="28"/>
-          <w14:ligatures w14:val="none"/>
-        </w:rPr>
-      </w:pPr>
-    </w:p>
-    <w:p>
-      <w:pPr>
-        <w:rPr>
-          <w:rFonts w:ascii="Times New Roman" w:eastAsiaTheme="majorEastAsia" w:hAnsi="Times New Roman" w:cs="Times New Roman"/>
-          <w:color w:val="000000" w:themeColor="text1"/>
-          <w:kern w:val="0"/>
-          <w:sz w:val="28"/>
-          <w:szCs w:val="28"/>
-          <w14:ligatures w14:val="none"/>
-        </w:rPr>
-      </w:pPr>
-    </w:p>
-    <w:p>
-      <w:pPr>
-        <w:rPr>
-          <w:rFonts w:ascii="Times New Roman" w:eastAsiaTheme="majorEastAsia" w:hAnsi="Times New Roman" w:cs="Times New Roman"/>
-          <w:color w:val="000000" w:themeColor="text1"/>
-          <w:kern w:val="0"/>
-          <w:sz w:val="28"/>
-          <w:szCs w:val="28"/>
-          <w14:ligatures w14:val="none"/>
-        </w:rPr>
-      </w:pPr>
-    </w:p>
-    <w:p>
-      <w:pPr>
-        <w:rPr>
-          <w:rFonts w:ascii="Times New Roman" w:eastAsiaTheme="majorEastAsia" w:hAnsi="Times New Roman" w:cs="Times New Roman"/>
-          <w:color w:val="000000" w:themeColor="text1"/>
-          <w:kern w:val="0"/>
-          <w:sz w:val="28"/>
-          <w:szCs w:val="28"/>
-          <w14:ligatures w14:val="none"/>
-        </w:rPr>
-      </w:pPr>
-    </w:p>
-    <w:p>
-      <w:pPr>
-        <w:rPr>
-          <w:rFonts w:ascii="Times New Roman" w:eastAsiaTheme="majorEastAsia" w:hAnsi="Times New Roman" w:cs="Times New Roman"/>
-          <w:color w:val="000000" w:themeColor="text1"/>
-          <w:kern w:val="0"/>
-          <w:sz w:val="28"/>
-          <w:szCs w:val="28"/>
-          <w14:ligatures w14:val="none"/>
-        </w:rPr>
-      </w:pPr>
-    </w:p>
-    <w:p>
-      <w:pPr>
-        <w:rPr>
-          <w:rFonts w:ascii="Times New Roman" w:eastAsiaTheme="majorEastAsia" w:hAnsi="Times New Roman" w:cs="Times New Roman"/>
-          <w:color w:val="000000" w:themeColor="text1"/>
-          <w:kern w:val="0"/>
-          <w:sz w:val="28"/>
-          <w:szCs w:val="28"/>
-          <w14:ligatures w14:val="none"/>
-        </w:rPr>
-      </w:pPr>
-    </w:p>
-    <w:p>
-      <w:pPr>
-        <w:rPr>
-          <w:rFonts w:ascii="Times New Roman" w:eastAsiaTheme="majorEastAsia" w:hAnsi="Times New Roman" w:cs="Times New Roman"/>
-          <w:color w:val="000000" w:themeColor="text1"/>
-          <w:kern w:val="0"/>
-          <w:sz w:val="28"/>
-          <w:szCs w:val="28"/>
-          <w14:ligatures w14:val="none"/>
-        </w:rPr>
-      </w:pPr>
-    </w:p>
-    <w:p>
-      <w:pPr>
-        <w:rPr>
-          <w:rFonts w:ascii="Times New Roman" w:eastAsiaTheme="majorEastAsia" w:hAnsi="Times New Roman" w:cs="Times New Roman"/>
-          <w:color w:val="000000" w:themeColor="text1"/>
-          <w:kern w:val="0"/>
-          <w:sz w:val="28"/>
-          <w:szCs w:val="28"/>
-          <w14:ligatures w14:val="none"/>
-        </w:rPr>
-      </w:pPr>
-    </w:p>
-    <w:p>
-      <w:pPr>
-        <w:rPr>
-          <w:rFonts w:ascii="Times New Roman" w:eastAsiaTheme="majorEastAsia" w:hAnsi="Times New Roman" w:cs="Times New Roman"/>
-          <w:color w:val="000000" w:themeColor="text1"/>
-          <w:kern w:val="0"/>
-          <w:sz w:val="28"/>
-          <w:szCs w:val="28"/>
-          <w14:ligatures w14:val="none"/>
-        </w:rPr>
-      </w:pPr>
-      <w:r>
-        <w:rPr>
-          <w:rFonts w:ascii="Times New Roman" w:eastAsiaTheme="majorEastAsia" w:hAnsi="Times New Roman" w:cs="Times New Roman"/>
-          <w:color w:val="000000" w:themeColor="text1"/>
-          <w:kern w:val="0"/>
-          <w:sz w:val="28"/>
-          <w:szCs w:val="28"/>
-          <w14:ligatures w14:val="none"/>
-        </w:rPr>
-        <w:lastRenderedPageBreak/>
+      <w:r>
+        <w:rPr>
+          <w:rFonts w:ascii="Times New Roman" w:eastAsiaTheme="majorEastAsia" w:hAnsi="Times New Roman" w:cs="Times New Roman"/>
+          <w:color w:val="000000" w:themeColor="text1"/>
+          <w:kern w:val="0"/>
+          <w:sz w:val="28"/>
+          <w:szCs w:val="28"/>
+          <w14:ligatures w14:val="none"/>
+        </w:rPr>
         <w:t>4.2 Class Diagram</w:t>
       </w:r>
     </w:p>
@@ -5620,7 +5902,55 @@
           <w:szCs w:val="28"/>
           <w14:ligatures w14:val="none"/>
         </w:rPr>
-        <w:t>At the center of the design is the abstract User class, which defines the attributes common to every account on the platform — full name, email, password, role, and audit timestamps. Three classes inherit from User through generalization: Customer, ServiceProvider, and Admin. Each subclass extends the shared user data with attributes specific to its role. Customer adds contact and address details along with a gender attribute. ServiceProvider adds the same contact details in addition to a list of skills, the services offered, and a verification status used to confirm that a provider has been approved by an administrator. Admin extends User with only an administrator identifier, since administrative accounts require no additional profile data.</w:t>
+        <w:t xml:space="preserve">At the center of the design is the abstract User class, which defines the attributes common to every account on the platform — full name, email, password, role, and audit timestamps. Three classes inherit from User through generalization: Customer, </w:t>
+      </w:r>
+      <w:proofErr w:type="spellStart"/>
+      <w:r>
+        <w:rPr>
+          <w:rFonts w:ascii="Times New Roman" w:eastAsiaTheme="majorEastAsia" w:hAnsi="Times New Roman" w:cs="Times New Roman"/>
+          <w:color w:val="000000" w:themeColor="text1"/>
+          <w:kern w:val="0"/>
+          <w:sz w:val="28"/>
+          <w:szCs w:val="28"/>
+          <w14:ligatures w14:val="none"/>
+        </w:rPr>
+        <w:t>ServiceProvider</w:t>
+      </w:r>
+      <w:proofErr w:type="spellEnd"/>
+      <w:r>
+        <w:rPr>
+          <w:rFonts w:ascii="Times New Roman" w:eastAsiaTheme="majorEastAsia" w:hAnsi="Times New Roman" w:cs="Times New Roman"/>
+          <w:color w:val="000000" w:themeColor="text1"/>
+          <w:kern w:val="0"/>
+          <w:sz w:val="28"/>
+          <w:szCs w:val="28"/>
+          <w14:ligatures w14:val="none"/>
+        </w:rPr>
+        <w:t xml:space="preserve">, and Admin. Each subclass extends the shared user data with attributes specific to its role. Customer adds contact and address details along with a gender attribute. </w:t>
+      </w:r>
+      <w:proofErr w:type="spellStart"/>
+      <w:r>
+        <w:rPr>
+          <w:rFonts w:ascii="Times New Roman" w:eastAsiaTheme="majorEastAsia" w:hAnsi="Times New Roman" w:cs="Times New Roman"/>
+          <w:color w:val="000000" w:themeColor="text1"/>
+          <w:kern w:val="0"/>
+          <w:sz w:val="28"/>
+          <w:szCs w:val="28"/>
+          <w14:ligatures w14:val="none"/>
+        </w:rPr>
+        <w:t>ServiceProvider</w:t>
+      </w:r>
+      <w:proofErr w:type="spellEnd"/>
+      <w:r>
+        <w:rPr>
+          <w:rFonts w:ascii="Times New Roman" w:eastAsiaTheme="majorEastAsia" w:hAnsi="Times New Roman" w:cs="Times New Roman"/>
+          <w:color w:val="000000" w:themeColor="text1"/>
+          <w:kern w:val="0"/>
+          <w:sz w:val="28"/>
+          <w:szCs w:val="28"/>
+          <w14:ligatures w14:val="none"/>
+        </w:rPr>
+        <w:t xml:space="preserve"> adds the same contact details in addition to a list of skills, the services offered, and a verification status used to confirm that a provider has been approved by an administrator. Admin extends User with only an administrator identifier, since administrative accounts require no additional profile data.</w:t>
       </w:r>
     </w:p>
     <w:p>
@@ -5666,30 +5996,102 @@
           <w:szCs w:val="28"/>
           <w14:ligatures w14:val="none"/>
         </w:rPr>
-        <w:t>The Booking class is the central entity linking the other classes together. Rather than embedding full object references, a Booking stores the identifiers and denormalized names of the associated Customer, ServiceProvider, and Service — a deliberate design choice suited to the document-oriented structure of MongoDB, allowing booking records to be read efficiently without repeated lookups. Each Booking also stores scheduling information, the service address, notes, the amount charged, and its current status.</w:t>
-      </w:r>
-    </w:p>
-    <w:p>
-      <w:pPr>
-        <w:rPr>
-          <w:rFonts w:ascii="Times New Roman" w:eastAsiaTheme="majorEastAsia" w:hAnsi="Times New Roman" w:cs="Times New Roman"/>
-          <w:color w:val="000000" w:themeColor="text1"/>
-          <w:kern w:val="0"/>
-          <w:sz w:val="28"/>
-          <w:szCs w:val="28"/>
-          <w14:ligatures w14:val="none"/>
-        </w:rPr>
-      </w:pPr>
-      <w:r>
-        <w:rPr>
-          <w:rFonts w:ascii="Times New Roman" w:eastAsiaTheme="majorEastAsia" w:hAnsi="Times New Roman" w:cs="Times New Roman"/>
-          <w:color w:val="000000" w:themeColor="text1"/>
-          <w:kern w:val="0"/>
-          <w:sz w:val="28"/>
-          <w:szCs w:val="28"/>
-          <w14:ligatures w14:val="none"/>
-        </w:rPr>
-        <w:t>Three enumerations support the class model: Role, which distinguishes Customer, Provider, and Admin accounts; Gender, used by both Customer and ServiceProvider; and BookingStatus, which defines the lifecycle of a booking as it moves from Pending through Accepted or Rejected, and ultimately to Completed or Cancelled.</w:t>
+        <w:t xml:space="preserve">The Booking class is the central entity linking the other classes together. Rather than embedding full object references, a Booking stores the identifiers and denormalized names of the associated Customer, </w:t>
+      </w:r>
+      <w:proofErr w:type="spellStart"/>
+      <w:r>
+        <w:rPr>
+          <w:rFonts w:ascii="Times New Roman" w:eastAsiaTheme="majorEastAsia" w:hAnsi="Times New Roman" w:cs="Times New Roman"/>
+          <w:color w:val="000000" w:themeColor="text1"/>
+          <w:kern w:val="0"/>
+          <w:sz w:val="28"/>
+          <w:szCs w:val="28"/>
+          <w14:ligatures w14:val="none"/>
+        </w:rPr>
+        <w:t>ServiceProvider</w:t>
+      </w:r>
+      <w:proofErr w:type="spellEnd"/>
+      <w:r>
+        <w:rPr>
+          <w:rFonts w:ascii="Times New Roman" w:eastAsiaTheme="majorEastAsia" w:hAnsi="Times New Roman" w:cs="Times New Roman"/>
+          <w:color w:val="000000" w:themeColor="text1"/>
+          <w:kern w:val="0"/>
+          <w:sz w:val="28"/>
+          <w:szCs w:val="28"/>
+          <w14:ligatures w14:val="none"/>
+        </w:rPr>
+        <w:t>, and Service — a deliberate design choice suited to the document-oriented structure of MongoDB, allowing booking records to be read efficiently without repeated lookups. Each Booking also stores scheduling information, the service address, notes, the amount charged, and its current status.</w:t>
+      </w:r>
+    </w:p>
+    <w:p>
+      <w:pPr>
+        <w:rPr>
+          <w:rFonts w:ascii="Times New Roman" w:eastAsiaTheme="majorEastAsia" w:hAnsi="Times New Roman" w:cs="Times New Roman"/>
+          <w:color w:val="000000" w:themeColor="text1"/>
+          <w:kern w:val="0"/>
+          <w:sz w:val="28"/>
+          <w:szCs w:val="28"/>
+          <w14:ligatures w14:val="none"/>
+        </w:rPr>
+      </w:pPr>
+      <w:r>
+        <w:rPr>
+          <w:rFonts w:ascii="Times New Roman" w:eastAsiaTheme="majorEastAsia" w:hAnsi="Times New Roman" w:cs="Times New Roman"/>
+          <w:color w:val="000000" w:themeColor="text1"/>
+          <w:kern w:val="0"/>
+          <w:sz w:val="28"/>
+          <w:szCs w:val="28"/>
+          <w14:ligatures w14:val="none"/>
+        </w:rPr>
+        <w:t xml:space="preserve">Three enumerations support the class model: Role, which distinguishes Customer, Provider, and Admin accounts; Gender, used by both Customer and </w:t>
+      </w:r>
+      <w:proofErr w:type="spellStart"/>
+      <w:r>
+        <w:rPr>
+          <w:rFonts w:ascii="Times New Roman" w:eastAsiaTheme="majorEastAsia" w:hAnsi="Times New Roman" w:cs="Times New Roman"/>
+          <w:color w:val="000000" w:themeColor="text1"/>
+          <w:kern w:val="0"/>
+          <w:sz w:val="28"/>
+          <w:szCs w:val="28"/>
+          <w14:ligatures w14:val="none"/>
+        </w:rPr>
+        <w:t>ServiceProvider</w:t>
+      </w:r>
+      <w:proofErr w:type="spellEnd"/>
+      <w:r>
+        <w:rPr>
+          <w:rFonts w:ascii="Times New Roman" w:eastAsiaTheme="majorEastAsia" w:hAnsi="Times New Roman" w:cs="Times New Roman"/>
+          <w:color w:val="000000" w:themeColor="text1"/>
+          <w:kern w:val="0"/>
+          <w:sz w:val="28"/>
+          <w:szCs w:val="28"/>
+          <w14:ligatures w14:val="none"/>
+        </w:rPr>
+        <w:t xml:space="preserve">; and </w:t>
+      </w:r>
+      <w:proofErr w:type="spellStart"/>
+      <w:r>
+        <w:rPr>
+          <w:rFonts w:ascii="Times New Roman" w:eastAsiaTheme="majorEastAsia" w:hAnsi="Times New Roman" w:cs="Times New Roman"/>
+          <w:color w:val="000000" w:themeColor="text1"/>
+          <w:kern w:val="0"/>
+          <w:sz w:val="28"/>
+          <w:szCs w:val="28"/>
+          <w14:ligatures w14:val="none"/>
+        </w:rPr>
+        <w:t>BookingStatus</w:t>
+      </w:r>
+      <w:proofErr w:type="spellEnd"/>
+      <w:r>
+        <w:rPr>
+          <w:rFonts w:ascii="Times New Roman" w:eastAsiaTheme="majorEastAsia" w:hAnsi="Times New Roman" w:cs="Times New Roman"/>
+          <w:color w:val="000000" w:themeColor="text1"/>
+          <w:kern w:val="0"/>
+          <w:sz w:val="28"/>
+          <w:szCs w:val="28"/>
+          <w14:ligatures w14:val="none"/>
+        </w:rPr>
+        <w:t>, which defines the lifecycle of a booking as it moves from Pending through Accepted or Rejected, and ultimately to Completed or Cancelled.</w:t>
       </w:r>
     </w:p>
     <w:p>
@@ -5808,7 +6210,6 @@
           <w:szCs w:val="28"/>
           <w14:ligatures w14:val="none"/>
         </w:rPr>
-        <w:lastRenderedPageBreak/>
         <w:drawing>
           <wp:inline distT="0" distB="0" distL="0" distR="0" wp14:anchorId="41EBBB03" wp14:editId="2D35194A">
             <wp:extent cx="6901180" cy="4953000"/>
@@ -5827,7 +6228,7 @@
                     </pic:cNvPicPr>
                   </pic:nvPicPr>
                   <pic:blipFill>
-                    <a:blip r:embed="rId9">
+                    <a:blip r:embed="rId10">
                       <a:extLst>
                         <a:ext uri="{28A0092B-C50C-407E-A947-70E740481C1C}">
                           <a14:useLocalDpi xmlns:a14="http://schemas.microsoft.com/office/drawing/2010/main" val="0"/>
@@ -5966,54 +6367,6 @@
           <w14:ligatures w14:val="none"/>
         </w:rPr>
       </w:pPr>
-    </w:p>
-    <w:p>
-      <w:pPr>
-        <w:rPr>
-          <w:rFonts w:ascii="Times New Roman" w:eastAsiaTheme="majorEastAsia" w:hAnsi="Times New Roman" w:cs="Times New Roman"/>
-          <w:color w:val="000000" w:themeColor="text1"/>
-          <w:kern w:val="0"/>
-          <w:sz w:val="28"/>
-          <w:szCs w:val="28"/>
-          <w14:ligatures w14:val="none"/>
-        </w:rPr>
-      </w:pPr>
-    </w:p>
-    <w:p>
-      <w:pPr>
-        <w:rPr>
-          <w:rFonts w:ascii="Times New Roman" w:eastAsiaTheme="majorEastAsia" w:hAnsi="Times New Roman" w:cs="Times New Roman"/>
-          <w:color w:val="000000" w:themeColor="text1"/>
-          <w:kern w:val="0"/>
-          <w:sz w:val="28"/>
-          <w:szCs w:val="28"/>
-          <w14:ligatures w14:val="none"/>
-        </w:rPr>
-      </w:pPr>
-    </w:p>
-    <w:p>
-      <w:pPr>
-        <w:rPr>
-          <w:rFonts w:ascii="Times New Roman" w:eastAsiaTheme="majorEastAsia" w:hAnsi="Times New Roman" w:cs="Times New Roman"/>
-          <w:color w:val="000000" w:themeColor="text1"/>
-          <w:kern w:val="0"/>
-          <w:sz w:val="28"/>
-          <w:szCs w:val="28"/>
-          <w14:ligatures w14:val="none"/>
-        </w:rPr>
-      </w:pPr>
-    </w:p>
-    <w:p>
-      <w:pPr>
-        <w:rPr>
-          <w:rFonts w:ascii="Times New Roman" w:eastAsiaTheme="majorEastAsia" w:hAnsi="Times New Roman" w:cs="Times New Roman"/>
-          <w:color w:val="000000" w:themeColor="text1"/>
-          <w:kern w:val="0"/>
-          <w:sz w:val="28"/>
-          <w:szCs w:val="28"/>
-          <w14:ligatures w14:val="none"/>
-        </w:rPr>
-      </w:pPr>
       <w:r>
         <w:rPr>
           <w:rFonts w:ascii="Times New Roman" w:eastAsiaTheme="majorEastAsia" w:hAnsi="Times New Roman" w:cs="Times New Roman"/>
@@ -6047,53 +6400,269 @@
           <w:szCs w:val="28"/>
           <w14:ligatures w14:val="none"/>
         </w:rPr>
-        <w:t>The Sequence Diagram illustrates the flow of interactions between the system components during the booking process, from the moment a customer submits a booking request to the moment a service provider responds to it. It captures the actual request flow implemented in the system: Customer, Frontend, BookingController, BookingService, MongoDB, and Provider.</w:t>
-      </w:r>
-    </w:p>
-    <w:p>
-      <w:pPr>
-        <w:rPr>
-          <w:rFonts w:ascii="Times New Roman" w:eastAsiaTheme="majorEastAsia" w:hAnsi="Times New Roman" w:cs="Times New Roman"/>
-          <w:color w:val="000000" w:themeColor="text1"/>
-          <w:kern w:val="0"/>
-          <w:sz w:val="28"/>
-          <w:szCs w:val="28"/>
-          <w14:ligatures w14:val="none"/>
-        </w:rPr>
-      </w:pPr>
-      <w:r>
-        <w:rPr>
-          <w:rFonts w:ascii="Times New Roman" w:eastAsiaTheme="majorEastAsia" w:hAnsi="Times New Roman" w:cs="Times New Roman"/>
-          <w:color w:val="000000" w:themeColor="text1"/>
-          <w:kern w:val="0"/>
-          <w:sz w:val="28"/>
-          <w:szCs w:val="28"/>
-          <w14:ligatures w14:val="none"/>
-        </w:rPr>
-        <w:t>The diagram is divided into two parts. The first part shows the booking creation flow. The customer selects a service provider and a service, and submits a booking request through the frontend. The frontend sends this request to the BookingController, which delegates the operation to the BookingService. The BookingService validates that the referenced customer, provider, and service all exist, constructs a new Booking object with an initial status of Pending, and persists it to MongoDB. A BookingResponse is then returned back through the controller and frontend layers, and the customer is shown a booking confirmation.</w:t>
-      </w:r>
-    </w:p>
-    <w:p>
-      <w:pPr>
-        <w:rPr>
-          <w:rFonts w:ascii="Times New Roman" w:eastAsiaTheme="majorEastAsia" w:hAnsi="Times New Roman" w:cs="Times New Roman"/>
-          <w:color w:val="000000" w:themeColor="text1"/>
-          <w:kern w:val="0"/>
-          <w:sz w:val="28"/>
-          <w:szCs w:val="28"/>
-          <w14:ligatures w14:val="none"/>
-        </w:rPr>
-      </w:pPr>
-      <w:r>
-        <w:rPr>
-          <w:rFonts w:ascii="Times New Roman" w:eastAsiaTheme="majorEastAsia" w:hAnsi="Times New Roman" w:cs="Times New Roman"/>
-          <w:color w:val="000000" w:themeColor="text1"/>
-          <w:kern w:val="0"/>
-          <w:sz w:val="28"/>
-          <w:szCs w:val="28"/>
-          <w14:ligatures w14:val="none"/>
-        </w:rPr>
-        <w:t>The second part, enclosed in an alt frame, represents the provider's response to the booking. The service provider views their pending job requests, which are retrieved from MongoDB through the same controller-service-repository chain. When the provider chooses to accept or reject a booking, the frontend sends a status update request to the BookingController, which calls the BookingService to verify that the provider owns the booking and that the requested status change is a valid transition before saving the update to MongoDB. The updated booking status is then returned to the frontend, and the customer is notified of the outcome.</w:t>
+        <w:t xml:space="preserve">The Sequence Diagram illustrates the flow of interactions between the system components during the booking </w:t>
+      </w:r>
+      <w:proofErr w:type="gramStart"/>
+      <w:r>
+        <w:rPr>
+          <w:rFonts w:ascii="Times New Roman" w:eastAsiaTheme="majorEastAsia" w:hAnsi="Times New Roman" w:cs="Times New Roman"/>
+          <w:color w:val="000000" w:themeColor="text1"/>
+          <w:kern w:val="0"/>
+          <w:sz w:val="28"/>
+          <w:szCs w:val="28"/>
+          <w14:ligatures w14:val="none"/>
+        </w:rPr>
+        <w:t>process,</w:t>
+      </w:r>
+      <w:proofErr w:type="gramEnd"/>
+      <w:r>
+        <w:rPr>
+          <w:rFonts w:ascii="Times New Roman" w:eastAsiaTheme="majorEastAsia" w:hAnsi="Times New Roman" w:cs="Times New Roman"/>
+          <w:color w:val="000000" w:themeColor="text1"/>
+          <w:kern w:val="0"/>
+          <w:sz w:val="28"/>
+          <w:szCs w:val="28"/>
+          <w14:ligatures w14:val="none"/>
+        </w:rPr>
+        <w:t xml:space="preserve"> from the moment a customer submits a booking request to the moment a service provider responds to it. It captures the actual request flow implemented in the system: Customer, Frontend, </w:t>
+      </w:r>
+      <w:proofErr w:type="spellStart"/>
+      <w:r>
+        <w:rPr>
+          <w:rFonts w:ascii="Times New Roman" w:eastAsiaTheme="majorEastAsia" w:hAnsi="Times New Roman" w:cs="Times New Roman"/>
+          <w:color w:val="000000" w:themeColor="text1"/>
+          <w:kern w:val="0"/>
+          <w:sz w:val="28"/>
+          <w:szCs w:val="28"/>
+          <w14:ligatures w14:val="none"/>
+        </w:rPr>
+        <w:t>BookingController</w:t>
+      </w:r>
+      <w:proofErr w:type="spellEnd"/>
+      <w:r>
+        <w:rPr>
+          <w:rFonts w:ascii="Times New Roman" w:eastAsiaTheme="majorEastAsia" w:hAnsi="Times New Roman" w:cs="Times New Roman"/>
+          <w:color w:val="000000" w:themeColor="text1"/>
+          <w:kern w:val="0"/>
+          <w:sz w:val="28"/>
+          <w:szCs w:val="28"/>
+          <w14:ligatures w14:val="none"/>
+        </w:rPr>
+        <w:t xml:space="preserve">, </w:t>
+      </w:r>
+      <w:proofErr w:type="spellStart"/>
+      <w:r>
+        <w:rPr>
+          <w:rFonts w:ascii="Times New Roman" w:eastAsiaTheme="majorEastAsia" w:hAnsi="Times New Roman" w:cs="Times New Roman"/>
+          <w:color w:val="000000" w:themeColor="text1"/>
+          <w:kern w:val="0"/>
+          <w:sz w:val="28"/>
+          <w:szCs w:val="28"/>
+          <w14:ligatures w14:val="none"/>
+        </w:rPr>
+        <w:t>BookingService</w:t>
+      </w:r>
+      <w:proofErr w:type="spellEnd"/>
+      <w:r>
+        <w:rPr>
+          <w:rFonts w:ascii="Times New Roman" w:eastAsiaTheme="majorEastAsia" w:hAnsi="Times New Roman" w:cs="Times New Roman"/>
+          <w:color w:val="000000" w:themeColor="text1"/>
+          <w:kern w:val="0"/>
+          <w:sz w:val="28"/>
+          <w:szCs w:val="28"/>
+          <w14:ligatures w14:val="none"/>
+        </w:rPr>
+        <w:t>, MongoDB, and Provider.</w:t>
+      </w:r>
+    </w:p>
+    <w:p>
+      <w:pPr>
+        <w:rPr>
+          <w:rFonts w:ascii="Times New Roman" w:eastAsiaTheme="majorEastAsia" w:hAnsi="Times New Roman" w:cs="Times New Roman"/>
+          <w:color w:val="000000" w:themeColor="text1"/>
+          <w:kern w:val="0"/>
+          <w:sz w:val="28"/>
+          <w:szCs w:val="28"/>
+          <w14:ligatures w14:val="none"/>
+        </w:rPr>
+      </w:pPr>
+      <w:r>
+        <w:rPr>
+          <w:rFonts w:ascii="Times New Roman" w:eastAsiaTheme="majorEastAsia" w:hAnsi="Times New Roman" w:cs="Times New Roman"/>
+          <w:color w:val="000000" w:themeColor="text1"/>
+          <w:kern w:val="0"/>
+          <w:sz w:val="28"/>
+          <w:szCs w:val="28"/>
+          <w14:ligatures w14:val="none"/>
+        </w:rPr>
+        <w:t xml:space="preserve">The diagram is divided into two parts. The first part shows the booking creation flow. The customer selects a service provider and a service, and submits a booking request through the frontend. The frontend sends this request to the </w:t>
+      </w:r>
+      <w:proofErr w:type="spellStart"/>
+      <w:r>
+        <w:rPr>
+          <w:rFonts w:ascii="Times New Roman" w:eastAsiaTheme="majorEastAsia" w:hAnsi="Times New Roman" w:cs="Times New Roman"/>
+          <w:color w:val="000000" w:themeColor="text1"/>
+          <w:kern w:val="0"/>
+          <w:sz w:val="28"/>
+          <w:szCs w:val="28"/>
+          <w14:ligatures w14:val="none"/>
+        </w:rPr>
+        <w:t>BookingController</w:t>
+      </w:r>
+      <w:proofErr w:type="spellEnd"/>
+      <w:r>
+        <w:rPr>
+          <w:rFonts w:ascii="Times New Roman" w:eastAsiaTheme="majorEastAsia" w:hAnsi="Times New Roman" w:cs="Times New Roman"/>
+          <w:color w:val="000000" w:themeColor="text1"/>
+          <w:kern w:val="0"/>
+          <w:sz w:val="28"/>
+          <w:szCs w:val="28"/>
+          <w14:ligatures w14:val="none"/>
+        </w:rPr>
+        <w:t xml:space="preserve">, which delegates the operation to the </w:t>
+      </w:r>
+      <w:proofErr w:type="spellStart"/>
+      <w:r>
+        <w:rPr>
+          <w:rFonts w:ascii="Times New Roman" w:eastAsiaTheme="majorEastAsia" w:hAnsi="Times New Roman" w:cs="Times New Roman"/>
+          <w:color w:val="000000" w:themeColor="text1"/>
+          <w:kern w:val="0"/>
+          <w:sz w:val="28"/>
+          <w:szCs w:val="28"/>
+          <w14:ligatures w14:val="none"/>
+        </w:rPr>
+        <w:t>BookingService</w:t>
+      </w:r>
+      <w:proofErr w:type="spellEnd"/>
+      <w:r>
+        <w:rPr>
+          <w:rFonts w:ascii="Times New Roman" w:eastAsiaTheme="majorEastAsia" w:hAnsi="Times New Roman" w:cs="Times New Roman"/>
+          <w:color w:val="000000" w:themeColor="text1"/>
+          <w:kern w:val="0"/>
+          <w:sz w:val="28"/>
+          <w:szCs w:val="28"/>
+          <w14:ligatures w14:val="none"/>
+        </w:rPr>
+        <w:t xml:space="preserve">. The </w:t>
+      </w:r>
+      <w:proofErr w:type="spellStart"/>
+      <w:r>
+        <w:rPr>
+          <w:rFonts w:ascii="Times New Roman" w:eastAsiaTheme="majorEastAsia" w:hAnsi="Times New Roman" w:cs="Times New Roman"/>
+          <w:color w:val="000000" w:themeColor="text1"/>
+          <w:kern w:val="0"/>
+          <w:sz w:val="28"/>
+          <w:szCs w:val="28"/>
+          <w14:ligatures w14:val="none"/>
+        </w:rPr>
+        <w:t>BookingService</w:t>
+      </w:r>
+      <w:proofErr w:type="spellEnd"/>
+      <w:r>
+        <w:rPr>
+          <w:rFonts w:ascii="Times New Roman" w:eastAsiaTheme="majorEastAsia" w:hAnsi="Times New Roman" w:cs="Times New Roman"/>
+          <w:color w:val="000000" w:themeColor="text1"/>
+          <w:kern w:val="0"/>
+          <w:sz w:val="28"/>
+          <w:szCs w:val="28"/>
+          <w14:ligatures w14:val="none"/>
+        </w:rPr>
+        <w:t xml:space="preserve"> validates that the referenced customer, provider, and service all exist, constructs a new Booking object with an initial status of Pending, and persists it to MongoDB. A </w:t>
+      </w:r>
+      <w:proofErr w:type="spellStart"/>
+      <w:r>
+        <w:rPr>
+          <w:rFonts w:ascii="Times New Roman" w:eastAsiaTheme="majorEastAsia" w:hAnsi="Times New Roman" w:cs="Times New Roman"/>
+          <w:color w:val="000000" w:themeColor="text1"/>
+          <w:kern w:val="0"/>
+          <w:sz w:val="28"/>
+          <w:szCs w:val="28"/>
+          <w14:ligatures w14:val="none"/>
+        </w:rPr>
+        <w:t>BookingResponse</w:t>
+      </w:r>
+      <w:proofErr w:type="spellEnd"/>
+      <w:r>
+        <w:rPr>
+          <w:rFonts w:ascii="Times New Roman" w:eastAsiaTheme="majorEastAsia" w:hAnsi="Times New Roman" w:cs="Times New Roman"/>
+          <w:color w:val="000000" w:themeColor="text1"/>
+          <w:kern w:val="0"/>
+          <w:sz w:val="28"/>
+          <w:szCs w:val="28"/>
+          <w14:ligatures w14:val="none"/>
+        </w:rPr>
+        <w:t xml:space="preserve"> is then returned back through the controller and frontend layers, and the customer is shown a booking confirmation.</w:t>
+      </w:r>
+    </w:p>
+    <w:p>
+      <w:pPr>
+        <w:rPr>
+          <w:rFonts w:ascii="Times New Roman" w:eastAsiaTheme="majorEastAsia" w:hAnsi="Times New Roman" w:cs="Times New Roman"/>
+          <w:color w:val="000000" w:themeColor="text1"/>
+          <w:kern w:val="0"/>
+          <w:sz w:val="28"/>
+          <w:szCs w:val="28"/>
+          <w14:ligatures w14:val="none"/>
+        </w:rPr>
+      </w:pPr>
+      <w:r>
+        <w:rPr>
+          <w:rFonts w:ascii="Times New Roman" w:eastAsiaTheme="majorEastAsia" w:hAnsi="Times New Roman" w:cs="Times New Roman"/>
+          <w:color w:val="000000" w:themeColor="text1"/>
+          <w:kern w:val="0"/>
+          <w:sz w:val="28"/>
+          <w:szCs w:val="28"/>
+          <w14:ligatures w14:val="none"/>
+        </w:rPr>
+        <w:t xml:space="preserve">The second part, enclosed in an alt frame, represents the provider's response to the booking. The service provider views their pending job requests, which are retrieved from MongoDB through the same controller-service-repository chain. When the provider chooses to accept or reject a booking, the frontend sends a status update request to the </w:t>
+      </w:r>
+      <w:proofErr w:type="spellStart"/>
+      <w:r>
+        <w:rPr>
+          <w:rFonts w:ascii="Times New Roman" w:eastAsiaTheme="majorEastAsia" w:hAnsi="Times New Roman" w:cs="Times New Roman"/>
+          <w:color w:val="000000" w:themeColor="text1"/>
+          <w:kern w:val="0"/>
+          <w:sz w:val="28"/>
+          <w:szCs w:val="28"/>
+          <w14:ligatures w14:val="none"/>
+        </w:rPr>
+        <w:t>BookingController</w:t>
+      </w:r>
+      <w:proofErr w:type="spellEnd"/>
+      <w:r>
+        <w:rPr>
+          <w:rFonts w:ascii="Times New Roman" w:eastAsiaTheme="majorEastAsia" w:hAnsi="Times New Roman" w:cs="Times New Roman"/>
+          <w:color w:val="000000" w:themeColor="text1"/>
+          <w:kern w:val="0"/>
+          <w:sz w:val="28"/>
+          <w:szCs w:val="28"/>
+          <w14:ligatures w14:val="none"/>
+        </w:rPr>
+        <w:t xml:space="preserve">, which calls the </w:t>
+      </w:r>
+      <w:proofErr w:type="spellStart"/>
+      <w:r>
+        <w:rPr>
+          <w:rFonts w:ascii="Times New Roman" w:eastAsiaTheme="majorEastAsia" w:hAnsi="Times New Roman" w:cs="Times New Roman"/>
+          <w:color w:val="000000" w:themeColor="text1"/>
+          <w:kern w:val="0"/>
+          <w:sz w:val="28"/>
+          <w:szCs w:val="28"/>
+          <w14:ligatures w14:val="none"/>
+        </w:rPr>
+        <w:t>BookingService</w:t>
+      </w:r>
+      <w:proofErr w:type="spellEnd"/>
+      <w:r>
+        <w:rPr>
+          <w:rFonts w:ascii="Times New Roman" w:eastAsiaTheme="majorEastAsia" w:hAnsi="Times New Roman" w:cs="Times New Roman"/>
+          <w:color w:val="000000" w:themeColor="text1"/>
+          <w:kern w:val="0"/>
+          <w:sz w:val="28"/>
+          <w:szCs w:val="28"/>
+          <w14:ligatures w14:val="none"/>
+        </w:rPr>
+        <w:t xml:space="preserve"> to verify that the provider owns the booking and that the requested status change is a valid transition before saving the update to MongoDB. The updated booking status is then returned to the frontend, and the customer is notified of the outcome.</w:t>
       </w:r>
     </w:p>
     <w:p>
@@ -6159,7 +6728,7 @@
                     </pic:cNvPicPr>
                   </pic:nvPicPr>
                   <pic:blipFill>
-                    <a:blip r:embed="rId10">
+                    <a:blip r:embed="rId11">
                       <a:extLst>
                         <a:ext uri="{28A0092B-C50C-407E-A947-70E740481C1C}">
                           <a14:useLocalDpi xmlns:a14="http://schemas.microsoft.com/office/drawing/2010/main" val="0"/>
@@ -6259,7 +6828,31 @@
           <w:szCs w:val="28"/>
           <w14:ligatures w14:val="none"/>
         </w:rPr>
-        <w:t>The Activity Diagram models the complete workflow of the booking process using swimlanes to separate the responsibilities of the Customer, the System (frontend and backend combined), and the Service Provider. It illustrates not only the sequence of actions but also the decision points that determine how the flow proceeds, based on the actual booking status state-machine implemented in the system.</w:t>
+        <w:t xml:space="preserve">The Activity Diagram models the complete workflow of the booking process using </w:t>
+      </w:r>
+      <w:proofErr w:type="spellStart"/>
+      <w:r>
+        <w:rPr>
+          <w:rFonts w:ascii="Times New Roman" w:eastAsiaTheme="majorEastAsia" w:hAnsi="Times New Roman" w:cs="Times New Roman"/>
+          <w:color w:val="000000" w:themeColor="text1"/>
+          <w:kern w:val="0"/>
+          <w:sz w:val="28"/>
+          <w:szCs w:val="28"/>
+          <w14:ligatures w14:val="none"/>
+        </w:rPr>
+        <w:t>swimlanes</w:t>
+      </w:r>
+      <w:proofErr w:type="spellEnd"/>
+      <w:r>
+        <w:rPr>
+          <w:rFonts w:ascii="Times New Roman" w:eastAsiaTheme="majorEastAsia" w:hAnsi="Times New Roman" w:cs="Times New Roman"/>
+          <w:color w:val="000000" w:themeColor="text1"/>
+          <w:kern w:val="0"/>
+          <w:sz w:val="28"/>
+          <w:szCs w:val="28"/>
+          <w14:ligatures w14:val="none"/>
+        </w:rPr>
+        <w:t xml:space="preserve"> to separate the responsibilities of the Customer, the System (frontend and backend combined), and the Service Provider. It illustrates not only the sequence of actions but also the decision points that determine how the flow proceeds, based on the actual booking status state-machine implemented in the system.</w:t>
       </w:r>
     </w:p>
     <w:p>
@@ -6351,7 +6944,31 @@
           <w:szCs w:val="28"/>
           <w14:ligatures w14:val="none"/>
         </w:rPr>
-        <w:t>This diagram demonstrates the complete decision logic governing a booking's lifecycle, directly reflecting the status transition rules enforced within the BookingService layer of the backend.</w:t>
+        <w:t xml:space="preserve">This diagram demonstrates the complete decision logic governing a booking's lifecycle, directly reflecting the status transition rules enforced within the </w:t>
+      </w:r>
+      <w:proofErr w:type="spellStart"/>
+      <w:r>
+        <w:rPr>
+          <w:rFonts w:ascii="Times New Roman" w:eastAsiaTheme="majorEastAsia" w:hAnsi="Times New Roman" w:cs="Times New Roman"/>
+          <w:color w:val="000000" w:themeColor="text1"/>
+          <w:kern w:val="0"/>
+          <w:sz w:val="28"/>
+          <w:szCs w:val="28"/>
+          <w14:ligatures w14:val="none"/>
+        </w:rPr>
+        <w:t>BookingService</w:t>
+      </w:r>
+      <w:proofErr w:type="spellEnd"/>
+      <w:r>
+        <w:rPr>
+          <w:rFonts w:ascii="Times New Roman" w:eastAsiaTheme="majorEastAsia" w:hAnsi="Times New Roman" w:cs="Times New Roman"/>
+          <w:color w:val="000000" w:themeColor="text1"/>
+          <w:kern w:val="0"/>
+          <w:sz w:val="28"/>
+          <w:szCs w:val="28"/>
+          <w14:ligatures w14:val="none"/>
+        </w:rPr>
+        <w:t xml:space="preserve"> layer of the backend.</w:t>
       </w:r>
     </w:p>
     <w:p>
@@ -6490,7 +7107,7 @@
                     </pic:cNvPicPr>
                   </pic:nvPicPr>
                   <pic:blipFill>
-                    <a:blip r:embed="rId11">
+                    <a:blip r:embed="rId12">
                       <a:extLst>
                         <a:ext uri="{28A0092B-C50C-407E-A947-70E740481C1C}">
                           <a14:useLocalDpi xmlns:a14="http://schemas.microsoft.com/office/drawing/2010/main" val="0"/>
@@ -7404,7 +8021,7 @@
         </w:rPr>
         <w:t xml:space="preserve">[10] GitHub Documentation. Available: </w:t>
       </w:r>
-      <w:hyperlink r:id="rId12" w:history="1">
+      <w:hyperlink r:id="rId13" w:history="1">
         <w:r>
           <w:rPr>
             <w:rStyle w:val="Hyperlink"/>
@@ -7453,7 +8070,7 @@
           <w14:ligatures w14:val="none"/>
         </w:rPr>
       </w:pPr>
-      <w:hyperlink r:id="rId13" w:history="1">
+      <w:hyperlink r:id="rId14" w:history="1">
         <w:r>
           <w:rPr>
             <w:rStyle w:val="Hyperlink"/>
@@ -7463,40 +8080,7 @@
             <w:szCs w:val="28"/>
             <w14:ligatures w14:val="none"/>
           </w:rPr>
-          <w:t>https://github.com/Sathirasugeesvara/Wo</w:t>
-        </w:r>
-        <w:r>
-          <w:rPr>
-            <w:rStyle w:val="Hyperlink"/>
-            <w:rFonts w:ascii="Times New Roman" w:eastAsiaTheme="majorEastAsia" w:hAnsi="Times New Roman" w:cs="Times New Roman"/>
-            <w:kern w:val="0"/>
-            <w:sz w:val="28"/>
-            <w:szCs w:val="28"/>
-            <w14:ligatures w14:val="none"/>
-          </w:rPr>
-          <w:t>r</w:t>
-        </w:r>
-        <w:r>
-          <w:rPr>
-            <w:rStyle w:val="Hyperlink"/>
-            <w:rFonts w:ascii="Times New Roman" w:eastAsiaTheme="majorEastAsia" w:hAnsi="Times New Roman" w:cs="Times New Roman"/>
-            <w:kern w:val="0"/>
-            <w:sz w:val="28"/>
-            <w:szCs w:val="28"/>
-            <w14:ligatures w14:val="none"/>
-          </w:rPr>
-          <w:t>kly.git</w:t>
-        </w:r>
-        <w:r>
-          <w:rPr>
-            <w:rStyle w:val="Hyperlink"/>
-            <w:rFonts w:ascii="Times New Roman" w:eastAsiaTheme="majorEastAsia" w:hAnsi="Times New Roman" w:cs="Times New Roman"/>
-            <w:kern w:val="0"/>
-            <w:sz w:val="28"/>
-            <w:szCs w:val="28"/>
-            <w14:ligatures w14:val="none"/>
-          </w:rPr>
-          <w:t>/</w:t>
+          <w:t>https://github.com/Sathirasugeesvara/Workly.git/</w:t>
         </w:r>
       </w:hyperlink>
     </w:p>
@@ -7771,6 +8355,29 @@
               <w:t>API calling</w:t>
             </w:r>
           </w:p>
+          <w:p>
+            <w:pPr>
+              <w:rPr>
+                <w:rFonts w:ascii="Times New Roman" w:eastAsiaTheme="majorEastAsia" w:hAnsi="Times New Roman" w:cs="Times New Roman"/>
+                <w:color w:val="000000" w:themeColor="text1"/>
+                <w:kern w:val="0"/>
+                <w:sz w:val="28"/>
+                <w:szCs w:val="28"/>
+                <w14:ligatures w14:val="none"/>
+              </w:rPr>
+            </w:pPr>
+            <w:r>
+              <w:rPr>
+                <w:rFonts w:ascii="Times New Roman" w:eastAsiaTheme="majorEastAsia" w:hAnsi="Times New Roman" w:cs="Times New Roman"/>
+                <w:color w:val="000000" w:themeColor="text1"/>
+                <w:kern w:val="0"/>
+                <w:sz w:val="28"/>
+                <w:szCs w:val="28"/>
+                <w14:ligatures w14:val="none"/>
+              </w:rPr>
+              <w:t>Hosting</w:t>
+            </w:r>
+          </w:p>
         </w:tc>
         <w:tc>
           <w:tcPr>
@@ -7897,11 +8504,10 @@
                 <w:szCs w:val="28"/>
                 <w14:ligatures w14:val="none"/>
               </w:rPr>
-              <w:t>Document prepairing</w:t>
+              <w:t xml:space="preserve">Document </w:t>
             </w:r>
-          </w:p>
-          <w:p>
-            <w:pPr>
+            <w:proofErr w:type="spellStart"/>
+            <w:r>
               <w:rPr>
                 <w:rFonts w:ascii="Times New Roman" w:eastAsiaTheme="majorEastAsia" w:hAnsi="Times New Roman" w:cs="Times New Roman"/>
                 <w:color w:val="000000" w:themeColor="text1"/>
@@ -7910,8 +8516,12 @@
                 <w:szCs w:val="28"/>
                 <w14:ligatures w14:val="none"/>
               </w:rPr>
-            </w:pPr>
-            <w:r>
+              <w:t>prepairing</w:t>
+            </w:r>
+            <w:proofErr w:type="spellEnd"/>
+          </w:p>
+          <w:p>
+            <w:pPr>
               <w:rPr>
                 <w:rFonts w:ascii="Times New Roman" w:eastAsiaTheme="majorEastAsia" w:hAnsi="Times New Roman" w:cs="Times New Roman"/>
                 <w:color w:val="000000" w:themeColor="text1"/>
@@ -7920,7 +8530,40 @@
                 <w:szCs w:val="28"/>
                 <w14:ligatures w14:val="none"/>
               </w:rPr>
+            </w:pPr>
+            <w:r>
+              <w:rPr>
+                <w:rFonts w:ascii="Times New Roman" w:eastAsiaTheme="majorEastAsia" w:hAnsi="Times New Roman" w:cs="Times New Roman"/>
+                <w:color w:val="000000" w:themeColor="text1"/>
+                <w:kern w:val="0"/>
+                <w:sz w:val="28"/>
+                <w:szCs w:val="28"/>
+                <w14:ligatures w14:val="none"/>
+              </w:rPr>
               <w:t>API calling</w:t>
+            </w:r>
+          </w:p>
+          <w:p>
+            <w:pPr>
+              <w:rPr>
+                <w:rFonts w:ascii="Times New Roman" w:eastAsiaTheme="majorEastAsia" w:hAnsi="Times New Roman" w:cs="Times New Roman"/>
+                <w:color w:val="000000" w:themeColor="text1"/>
+                <w:kern w:val="0"/>
+                <w:sz w:val="28"/>
+                <w:szCs w:val="28"/>
+                <w14:ligatures w14:val="none"/>
+              </w:rPr>
+            </w:pPr>
+            <w:r>
+              <w:rPr>
+                <w:rFonts w:ascii="Times New Roman" w:eastAsiaTheme="majorEastAsia" w:hAnsi="Times New Roman" w:cs="Times New Roman"/>
+                <w:color w:val="000000" w:themeColor="text1"/>
+                <w:kern w:val="0"/>
+                <w:sz w:val="28"/>
+                <w:szCs w:val="28"/>
+                <w14:ligatures w14:val="none"/>
+              </w:rPr>
+              <w:t>Hosting</w:t>
             </w:r>
           </w:p>
         </w:tc>
@@ -8808,6 +9451,7 @@
   <w:style w:type="character" w:default="1" w:styleId="DefaultParagraphFont">
     <w:name w:val="Default Paragraph Font"/>
     <w:uiPriority w:val="1"/>
+    <w:semiHidden/>
     <w:unhideWhenUsed/>
   </w:style>
   <w:style w:type="table" w:default="1" w:styleId="TableNormal">

</xml_diff>